<commit_message>
Update project documentation, fix Customer Journey Map, add missing PDFs, consolidate Flask app
</commit_message>
<xml_diff>
--- a/Ideation Phase/Brain Storming.docx
+++ b/Ideation Phase/Brain Storming.docx
@@ -1,6 +1,6 @@
 
 <file path=word/document.xml><?xml version="1.0" encoding="utf-8"?>
-<w:document xmlns:wpc="http://schemas.microsoft.com/office/word/2010/wordprocessingCanvas" xmlns:cx="http://schemas.microsoft.com/office/drawing/2014/chartex" xmlns:cx1="http://schemas.microsoft.com/office/drawing/2015/9/8/chartex" xmlns:cx2="http://schemas.microsoft.com/office/drawing/2015/10/21/chartex" xmlns:cx3="http://schemas.microsoft.com/office/drawing/2016/5/9/chartex" xmlns:cx4="http://schemas.microsoft.com/office/drawing/2016/5/10/chartex" xmlns:cx5="http://schemas.microsoft.com/office/drawing/2016/5/11/chartex" xmlns:cx6="http://schemas.microsoft.com/office/drawing/2016/5/12/chartex" xmlns:cx7="http://schemas.microsoft.com/office/drawing/2016/5/13/chartex" xmlns:cx8="http://schemas.microsoft.com/office/drawing/2016/5/14/chartex" xmlns:mc="http://schemas.openxmlformats.org/markup-compatibility/2006" xmlns:aink="http://schemas.microsoft.com/office/drawing/2016/ink" xmlns:am3d="http://schemas.microsoft.com/office/drawing/2017/model3d" xmlns:o="urn:schemas-microsoft-com:office:office" xmlns:oel="http://schemas.microsoft.com/office/2019/extlst" xmlns:r="http://schemas.openxmlformats.org/officeDocument/2006/relationships" xmlns:m="http://schemas.openxmlformats.org/officeDocument/2006/math" xmlns:v="urn:schemas-microsoft-com:vml" xmlns:wp14="http://schemas.microsoft.com/office/word/2010/wordprocessingDrawing" xmlns:wp="http://schemas.openxmlformats.org/drawingml/2006/wordprocessingDrawing" xmlns:w10="urn:schemas-microsoft-com:office:word" xmlns:w="http://schemas.openxmlformats.org/wordprocessingml/2006/main" xmlns:w14="http://schemas.microsoft.com/office/word/2010/wordml" xmlns:w15="http://schemas.microsoft.com/office/word/2012/wordml" xmlns:w16cex="http://schemas.microsoft.com/office/word/2018/wordml/cex" xmlns:w16cid="http://schemas.microsoft.com/office/word/2016/wordml/cid" xmlns:w16="http://schemas.microsoft.com/office/word/2018/wordml" xmlns:w16du="http://schemas.microsoft.com/office/word/2023/wordml/word16du" xmlns:w16sdtdh="http://schemas.microsoft.com/office/word/2020/wordml/sdtdatahash" xmlns:w16sdtfl="http://schemas.microsoft.com/office/word/2024/wordml/sdtformatlock" xmlns:w16se="http://schemas.microsoft.com/office/word/2015/wordml/symex" xmlns:wpg="http://schemas.microsoft.com/office/word/2010/wordprocessingGroup" xmlns:wpi="http://schemas.microsoft.com/office/word/2010/wordprocessingInk" xmlns:wne="http://schemas.microsoft.com/office/word/2006/wordml" xmlns:wps="http://schemas.microsoft.com/office/word/2010/wordprocessingShape" mc:Ignorable="w14 w15 w16se w16cid w16 w16cex w16sdtdh w16sdtfl w16du wp14">
+<w:document xmlns:ve="http://schemas.openxmlformats.org/markup-compatibility/2006" xmlns:o="urn:schemas-microsoft-com:office:office" xmlns:r="http://schemas.openxmlformats.org/officeDocument/2006/relationships" xmlns:m="http://schemas.openxmlformats.org/officeDocument/2006/math" xmlns:v="urn:schemas-microsoft-com:vml" xmlns:wp="http://schemas.openxmlformats.org/drawingml/2006/wordprocessingDrawing" xmlns:w10="urn:schemas-microsoft-com:office:word" xmlns:w="http://schemas.openxmlformats.org/wordprocessingml/2006/main" xmlns:wne="http://schemas.microsoft.com/office/word/2006/wordml">
   <w:body>
     <w:p>
       <w:pPr>
@@ -64,7 +64,7 @@
           <w:insideV w:val="single" w:sz="4" w:space="0" w:color="000000"/>
         </w:tblBorders>
         <w:tblLayout w:type="fixed"/>
-        <w:tblLook w:val="0400" w:firstRow="0" w:lastRow="0" w:firstColumn="0" w:lastColumn="0" w:noHBand="0" w:noVBand="1"/>
+        <w:tblLook w:val="0400"/>
       </w:tblPr>
       <w:tblGrid>
         <w:gridCol w:w="4508"/>
@@ -169,289 +169,64 @@
       </w:pPr>
     </w:p>
     <w:p>
-      <w:r>
-        <w:t>Team: Dharshini Priya S, Thanusha Peneti, Yogananda Reddy Chinnannagari, Mudiyala Shashank Reddy</w:t>
-      </w:r>
-    </w:p>
-    <w:p>
-      <w:pPr>
-        <w:rPr>
-          <w:b/>
-          <w:sz w:val="24"/>
-          <w:szCs w:val="24"/>
-        </w:rPr>
-      </w:pPr>
-      <w:r>
-        <w:rPr>
-          <w:b/>
-          <w:sz w:val="24"/>
-          <w:szCs w:val="24"/>
-        </w:rPr>
-        <w:t>Brainstorm &amp; Idea Prioritization Template:</w:t>
-      </w:r>
-    </w:p>
-    <w:p>
-      <w:pPr>
-        <w:pBdr>
-          <w:top w:val="nil"/>
-          <w:left w:val="nil"/>
-          <w:bottom w:val="nil"/>
-          <w:right w:val="nil"/>
-          <w:between w:val="nil"/>
-        </w:pBdr>
-        <w:shd w:val="clear" w:color="auto" w:fill="FFFFFF"/>
-        <w:spacing w:line="240" w:lineRule="auto"/>
-        <w:jc w:val="both"/>
-        <w:rPr>
-          <w:color w:val="000000"/>
-          <w:sz w:val="24"/>
-          <w:szCs w:val="24"/>
-        </w:rPr>
-      </w:pPr>
-      <w:r>
-        <w:rPr>
-          <w:color w:val="000000"/>
-          <w:sz w:val="24"/>
-          <w:szCs w:val="24"/>
-        </w:rPr>
-        <w:t>Brainstorming provides a free and open environment that encourages everyone within a team to participate in the creative thinking process that leads to problem solving. Prioritizing volume over value, out-of-the-box ideas are welcome and built upon, and all participants are encouraged to collaborate, helping each other develop a rich amount of creative solutions.</w:t>
-      </w:r>
-    </w:p>
-    <w:p>
-      <w:pPr>
-        <w:pBdr>
-          <w:top w:val="nil"/>
-          <w:left w:val="nil"/>
-          <w:bottom w:val="nil"/>
-          <w:right w:val="nil"/>
-          <w:between w:val="nil"/>
-        </w:pBdr>
-        <w:shd w:val="clear" w:color="auto" w:fill="FFFFFF"/>
-        <w:spacing w:line="240" w:lineRule="auto"/>
-        <w:jc w:val="both"/>
-        <w:rPr>
-          <w:color w:val="000000"/>
-          <w:sz w:val="24"/>
-          <w:szCs w:val="24"/>
-        </w:rPr>
-      </w:pPr>
-      <w:r>
-        <w:rPr>
-          <w:color w:val="000000"/>
-          <w:sz w:val="24"/>
-          <w:szCs w:val="24"/>
-        </w:rPr>
-        <w:t>Use this template in your own brainstorming sessions so your team can unleash their imagination and start shaping concepts even if you're not sitting in the same room.</w:t>
-      </w:r>
-    </w:p>
-    <w:p>
-      <w:pPr>
-        <w:rPr>
-          <w:color w:val="0563C1"/>
-          <w:u w:val="single"/>
-        </w:rPr>
-      </w:pPr>
-      <w:r>
-        <w:rPr>
-          <w:sz w:val="24"/>
-          <w:szCs w:val="24"/>
-        </w:rPr>
-        <w:t xml:space="preserve">Reference: </w:t>
-      </w:r>
-      <w:hyperlink r:id="rId7">
-        <w:r>
-          <w:rPr>
-            <w:color w:val="1155CC"/>
-            <w:u w:val="single"/>
-          </w:rPr>
-          <w:t>https://www.mural.co/templates/brainstorm-and-idea-prioritization</w:t>
-        </w:r>
-      </w:hyperlink>
-    </w:p>
-    <w:p>
-      <w:pPr>
-        <w:rPr>
-          <w:b/>
-          <w:sz w:val="24"/>
-          <w:szCs w:val="24"/>
-        </w:rPr>
-      </w:pPr>
-      <w:r>
-        <w:rPr>
-          <w:b/>
-          <w:sz w:val="24"/>
-          <w:szCs w:val="24"/>
-        </w:rPr>
-        <w:t>Step-1: Team Gathering, Collaboration and Select the Problem Statement</w:t>
-      </w:r>
-    </w:p>
-    <w:p>
-      <w:r>
-        <w:rPr>
-          <w:noProof/>
-        </w:rPr>
-        <w:drawing>
-          <wp:inline distT="0" distB="0" distL="0" distR="0" wp14:anchorId="4D61E091" wp14:editId="3EF0E83A">
-            <wp:extent cx="5731510" cy="4185285"/>
-            <wp:effectExtent l="0" t="0" r="0" b="0"/>
-            <wp:docPr id="6" name="image3.png" descr="Graphical user interface, application&#10;&#10;Description automatically generated"/>
-            <wp:cNvGraphicFramePr/>
-            <a:graphic xmlns:a="http://schemas.openxmlformats.org/drawingml/2006/main">
-              <a:graphicData uri="http://schemas.openxmlformats.org/drawingml/2006/picture">
-                <pic:pic xmlns:pic="http://schemas.openxmlformats.org/drawingml/2006/picture">
-                  <pic:nvPicPr>
-                    <pic:cNvPr id="0" name="image3.png" descr="Graphical user interface, application&#10;&#10;Description automatically generated"/>
-                    <pic:cNvPicPr preferRelativeResize="0"/>
-                  </pic:nvPicPr>
-                  <pic:blipFill>
-                    <a:blip r:embed="rId8"/>
-                    <a:srcRect/>
-                    <a:stretch>
-                      <a:fillRect/>
-                    </a:stretch>
-                  </pic:blipFill>
-                  <pic:spPr>
-                    <a:xfrm>
-                      <a:off x="0" y="0"/>
-                      <a:ext cx="5731510" cy="4185285"/>
-                    </a:xfrm>
-                    <a:prstGeom prst="rect">
-                      <a:avLst/>
-                    </a:prstGeom>
-                    <a:ln/>
-                  </pic:spPr>
-                </pic:pic>
-              </a:graphicData>
-            </a:graphic>
-          </wp:inline>
-        </w:drawing>
-      </w:r>
-    </w:p>
-    <w:p/>
-    <w:p/>
-    <w:p/>
-    <w:p>
-      <w:pPr>
-        <w:rPr>
-          <w:b/>
-        </w:rPr>
-      </w:pPr>
-      <w:r>
-        <w:rPr>
-          <w:b/>
-        </w:rPr>
-        <w:t>Step-2: Brainstorm, Idea Listing and Grouping</w:t>
-      </w:r>
-    </w:p>
-    <w:p>
-      <w:r>
-        <w:rPr>
-          <w:noProof/>
-        </w:rPr>
-        <w:drawing>
-          <wp:inline distT="0" distB="0" distL="0" distR="0" wp14:anchorId="3B09D2D6" wp14:editId="02EA2673">
-            <wp:extent cx="5731510" cy="3827780"/>
-            <wp:effectExtent l="0" t="0" r="0" b="0"/>
-            <wp:docPr id="8" name="image2.png" descr="Graphical user interface, treemap chart&#10;&#10;Description automatically generated"/>
-            <wp:cNvGraphicFramePr/>
-            <a:graphic xmlns:a="http://schemas.openxmlformats.org/drawingml/2006/main">
-              <a:graphicData uri="http://schemas.openxmlformats.org/drawingml/2006/picture">
-                <pic:pic xmlns:pic="http://schemas.openxmlformats.org/drawingml/2006/picture">
-                  <pic:nvPicPr>
-                    <pic:cNvPr id="0" name="image2.png" descr="Graphical user interface, treemap chart&#10;&#10;Description automatically generated"/>
-                    <pic:cNvPicPr preferRelativeResize="0"/>
-                  </pic:nvPicPr>
-                  <pic:blipFill>
-                    <a:blip r:embed="rId9"/>
-                    <a:srcRect/>
-                    <a:stretch>
-                      <a:fillRect/>
-                    </a:stretch>
-                  </pic:blipFill>
-                  <pic:spPr>
-                    <a:xfrm>
-                      <a:off x="0" y="0"/>
-                      <a:ext cx="5731510" cy="3827780"/>
-                    </a:xfrm>
-                    <a:prstGeom prst="rect">
-                      <a:avLst/>
-                    </a:prstGeom>
-                    <a:ln/>
-                  </pic:spPr>
-                </pic:pic>
-              </a:graphicData>
-            </a:graphic>
-          </wp:inline>
-        </w:drawing>
-      </w:r>
-    </w:p>
-    <w:p/>
-    <w:p>
-      <w:pPr>
-        <w:rPr>
-          <w:b/>
-        </w:rPr>
-      </w:pPr>
-      <w:r>
-        <w:rPr>
-          <w:b/>
-        </w:rPr>
-        <w:t>Step-3: Idea Prioritization</w:t>
-      </w:r>
-    </w:p>
-    <w:p>
-      <w:pPr>
-        <w:rPr>
-          <w:sz w:val="24"/>
-          <w:szCs w:val="24"/>
-        </w:rPr>
-      </w:pPr>
-      <w:r>
-        <w:rPr>
-          <w:b/>
-          <w:noProof/>
-        </w:rPr>
-        <w:lastRenderedPageBreak/>
-        <w:drawing>
-          <wp:inline distT="0" distB="0" distL="0" distR="0" wp14:anchorId="6BD1C0EC" wp14:editId="68E311F3">
-            <wp:extent cx="3611587" cy="4323123"/>
-            <wp:effectExtent l="0" t="0" r="0" b="0"/>
-            <wp:docPr id="7" name="image1.png" descr="Diagram&#10;&#10;Description automatically generated"/>
-            <wp:cNvGraphicFramePr/>
-            <a:graphic xmlns:a="http://schemas.openxmlformats.org/drawingml/2006/main">
-              <a:graphicData uri="http://schemas.openxmlformats.org/drawingml/2006/picture">
-                <pic:pic xmlns:pic="http://schemas.openxmlformats.org/drawingml/2006/picture">
-                  <pic:nvPicPr>
-                    <pic:cNvPr id="0" name="image1.png" descr="Diagram&#10;&#10;Description automatically generated"/>
-                    <pic:cNvPicPr preferRelativeResize="0"/>
-                  </pic:nvPicPr>
-                  <pic:blipFill>
-                    <a:blip r:embed="rId10"/>
-                    <a:srcRect/>
-                    <a:stretch>
-                      <a:fillRect/>
-                    </a:stretch>
-                  </pic:blipFill>
-                  <pic:spPr>
-                    <a:xfrm>
-                      <a:off x="0" y="0"/>
-                      <a:ext cx="3611587" cy="4323123"/>
-                    </a:xfrm>
-                    <a:prstGeom prst="rect">
-                      <a:avLst/>
-                    </a:prstGeom>
-                    <a:ln/>
-                  </pic:spPr>
-                </pic:pic>
-              </a:graphicData>
-            </a:graphic>
-          </wp:inline>
-        </w:drawing>
-      </w:r>
-    </w:p>
-    <w:p>
-      <w:r>
-        <w:br w:type="page"/>
+      <w:pPr>
+        <w:rPr>
+          <w:b/>
+        </w:rPr>
+      </w:pPr>
+      <w:r>
+        <w:t xml:space="preserve">Team: </w:t>
+      </w:r>
+      <w:r>
+        <w:rPr>
+          <w:b/>
+        </w:rPr>
+        <w:t>Dharshini Priya S</w:t>
+      </w:r>
+    </w:p>
+    <w:p>
+      <w:pPr>
+        <w:rPr>
+          <w:b/>
+        </w:rPr>
+      </w:pPr>
+      <w:r>
+        <w:rPr>
+          <w:b/>
+        </w:rPr>
+        <w:t xml:space="preserve">            Thanusha Peneti </w:t>
+      </w:r>
+    </w:p>
+    <w:p>
+      <w:pPr>
+        <w:rPr>
+          <w:b/>
+        </w:rPr>
+      </w:pPr>
+      <w:r>
+        <w:rPr>
+          <w:b/>
+        </w:rPr>
+        <w:t xml:space="preserve">            Yogananda Reddy Chinnannagari</w:t>
+      </w:r>
+    </w:p>
+    <w:p>
+      <w:pPr>
+        <w:rPr>
+          <w:b/>
+        </w:rPr>
+      </w:pPr>
+      <w:r>
+        <w:rPr>
+          <w:b/>
+        </w:rPr>
+        <w:t xml:space="preserve">            </w:t>
+      </w:r>
+      <w:r>
+        <w:rPr>
+          <w:b/>
+        </w:rPr>
+        <w:t>Mudiyala Shashank Reddy</w:t>
       </w:r>
     </w:p>
     <w:p>
@@ -459,7 +234,6 @@
         <w:pStyle w:val="Heading2"/>
       </w:pPr>
       <w:r>
-        <w:lastRenderedPageBreak/>
         <w:t>Our Brainstorming Session</w:t>
       </w:r>
     </w:p>
@@ -528,7 +302,7 @@
       </w:r>
     </w:p>
     <w:sectPr>
-      <w:headerReference w:type="default" r:id="rId11"/>
+      <w:headerReference w:type="default" r:id="rId7"/>
       <w:pgSz w:w="11906" w:h="16838"/>
       <w:pgMar w:top="851" w:right="1440" w:bottom="1440" w:left="1440" w:header="708" w:footer="708" w:gutter="0"/>
       <w:pgNumType w:start="1"/>
@@ -539,8 +313,8 @@
 </file>
 
 <file path=word/endnotes.xml><?xml version="1.0" encoding="utf-8"?>
-<w:endnotes xmlns:wpc="http://schemas.microsoft.com/office/word/2010/wordprocessingCanvas" xmlns:cx="http://schemas.microsoft.com/office/drawing/2014/chartex" xmlns:cx1="http://schemas.microsoft.com/office/drawing/2015/9/8/chartex" xmlns:cx2="http://schemas.microsoft.com/office/drawing/2015/10/21/chartex" xmlns:cx3="http://schemas.microsoft.com/office/drawing/2016/5/9/chartex" xmlns:cx4="http://schemas.microsoft.com/office/drawing/2016/5/10/chartex" xmlns:cx5="http://schemas.microsoft.com/office/drawing/2016/5/11/chartex" xmlns:cx6="http://schemas.microsoft.com/office/drawing/2016/5/12/chartex" xmlns:cx7="http://schemas.microsoft.com/office/drawing/2016/5/13/chartex" xmlns:cx8="http://schemas.microsoft.com/office/drawing/2016/5/14/chartex" xmlns:mc="http://schemas.openxmlformats.org/markup-compatibility/2006" xmlns:aink="http://schemas.microsoft.com/office/drawing/2016/ink" xmlns:am3d="http://schemas.microsoft.com/office/drawing/2017/model3d" xmlns:o="urn:schemas-microsoft-com:office:office" xmlns:oel="http://schemas.microsoft.com/office/2019/extlst" xmlns:r="http://schemas.openxmlformats.org/officeDocument/2006/relationships" xmlns:m="http://schemas.openxmlformats.org/officeDocument/2006/math" xmlns:v="urn:schemas-microsoft-com:vml" xmlns:wp14="http://schemas.microsoft.com/office/word/2010/wordprocessingDrawing" xmlns:wp="http://schemas.openxmlformats.org/drawingml/2006/wordprocessingDrawing" xmlns:w10="urn:schemas-microsoft-com:office:word" xmlns:w="http://schemas.openxmlformats.org/wordprocessingml/2006/main" xmlns:w14="http://schemas.microsoft.com/office/word/2010/wordml" xmlns:w15="http://schemas.microsoft.com/office/word/2012/wordml" xmlns:w16cex="http://schemas.microsoft.com/office/word/2018/wordml/cex" xmlns:w16cid="http://schemas.microsoft.com/office/word/2016/wordml/cid" xmlns:w16="http://schemas.microsoft.com/office/word/2018/wordml" xmlns:w16du="http://schemas.microsoft.com/office/word/2023/wordml/word16du" xmlns:w16sdtdh="http://schemas.microsoft.com/office/word/2020/wordml/sdtdatahash" xmlns:w16sdtfl="http://schemas.microsoft.com/office/word/2024/wordml/sdtformatlock" xmlns:w16se="http://schemas.microsoft.com/office/word/2015/wordml/symex" xmlns:wpg="http://schemas.microsoft.com/office/word/2010/wordprocessingGroup" xmlns:wpi="http://schemas.microsoft.com/office/word/2010/wordprocessingInk" xmlns:wne="http://schemas.microsoft.com/office/word/2006/wordml" xmlns:wps="http://schemas.microsoft.com/office/word/2010/wordprocessingShape" mc:Ignorable="w14 w15 w16se w16cid w16 w16cex w16sdtdh w16sdtfl w16du wp14">
-  <w:endnote w:type="separator" w:id="-1">
+<w:endnotes xmlns:ve="http://schemas.openxmlformats.org/markup-compatibility/2006" xmlns:o="urn:schemas-microsoft-com:office:office" xmlns:r="http://schemas.openxmlformats.org/officeDocument/2006/relationships" xmlns:m="http://schemas.openxmlformats.org/officeDocument/2006/math" xmlns:v="urn:schemas-microsoft-com:vml" xmlns:wp="http://schemas.openxmlformats.org/drawingml/2006/wordprocessingDrawing" xmlns:w10="urn:schemas-microsoft-com:office:word" xmlns:w="http://schemas.openxmlformats.org/wordprocessingml/2006/main" xmlns:wne="http://schemas.microsoft.com/office/word/2006/wordml">
+  <w:endnote w:type="separator" w:id="0">
     <w:p>
       <w:pPr>
         <w:spacing w:after="0" w:line="240" w:lineRule="auto"/>
@@ -550,7 +324,7 @@
       </w:r>
     </w:p>
   </w:endnote>
-  <w:endnote w:type="continuationSeparator" w:id="0">
+  <w:endnote w:type="continuationSeparator" w:id="1">
     <w:p>
       <w:pPr>
         <w:spacing w:after="0" w:line="240" w:lineRule="auto"/>
@@ -564,8 +338,8 @@
 </file>
 
 <file path=word/footnotes.xml><?xml version="1.0" encoding="utf-8"?>
-<w:footnotes xmlns:wpc="http://schemas.microsoft.com/office/word/2010/wordprocessingCanvas" xmlns:cx="http://schemas.microsoft.com/office/drawing/2014/chartex" xmlns:cx1="http://schemas.microsoft.com/office/drawing/2015/9/8/chartex" xmlns:cx2="http://schemas.microsoft.com/office/drawing/2015/10/21/chartex" xmlns:cx3="http://schemas.microsoft.com/office/drawing/2016/5/9/chartex" xmlns:cx4="http://schemas.microsoft.com/office/drawing/2016/5/10/chartex" xmlns:cx5="http://schemas.microsoft.com/office/drawing/2016/5/11/chartex" xmlns:cx6="http://schemas.microsoft.com/office/drawing/2016/5/12/chartex" xmlns:cx7="http://schemas.microsoft.com/office/drawing/2016/5/13/chartex" xmlns:cx8="http://schemas.microsoft.com/office/drawing/2016/5/14/chartex" xmlns:mc="http://schemas.openxmlformats.org/markup-compatibility/2006" xmlns:aink="http://schemas.microsoft.com/office/drawing/2016/ink" xmlns:am3d="http://schemas.microsoft.com/office/drawing/2017/model3d" xmlns:o="urn:schemas-microsoft-com:office:office" xmlns:oel="http://schemas.microsoft.com/office/2019/extlst" xmlns:r="http://schemas.openxmlformats.org/officeDocument/2006/relationships" xmlns:m="http://schemas.openxmlformats.org/officeDocument/2006/math" xmlns:v="urn:schemas-microsoft-com:vml" xmlns:wp14="http://schemas.microsoft.com/office/word/2010/wordprocessingDrawing" xmlns:wp="http://schemas.openxmlformats.org/drawingml/2006/wordprocessingDrawing" xmlns:w10="urn:schemas-microsoft-com:office:word" xmlns:w="http://schemas.openxmlformats.org/wordprocessingml/2006/main" xmlns:w14="http://schemas.microsoft.com/office/word/2010/wordml" xmlns:w15="http://schemas.microsoft.com/office/word/2012/wordml" xmlns:w16cex="http://schemas.microsoft.com/office/word/2018/wordml/cex" xmlns:w16cid="http://schemas.microsoft.com/office/word/2016/wordml/cid" xmlns:w16="http://schemas.microsoft.com/office/word/2018/wordml" xmlns:w16du="http://schemas.microsoft.com/office/word/2023/wordml/word16du" xmlns:w16sdtdh="http://schemas.microsoft.com/office/word/2020/wordml/sdtdatahash" xmlns:w16sdtfl="http://schemas.microsoft.com/office/word/2024/wordml/sdtformatlock" xmlns:w16se="http://schemas.microsoft.com/office/word/2015/wordml/symex" xmlns:wpg="http://schemas.microsoft.com/office/word/2010/wordprocessingGroup" xmlns:wpi="http://schemas.microsoft.com/office/word/2010/wordprocessingInk" xmlns:wne="http://schemas.microsoft.com/office/word/2006/wordml" xmlns:wps="http://schemas.microsoft.com/office/word/2010/wordprocessingShape" mc:Ignorable="w14 w15 w16se w16cid w16 w16cex w16sdtdh w16sdtfl w16du wp14">
-  <w:footnote w:type="separator" w:id="-1">
+<w:footnotes xmlns:ve="http://schemas.openxmlformats.org/markup-compatibility/2006" xmlns:o="urn:schemas-microsoft-com:office:office" xmlns:r="http://schemas.openxmlformats.org/officeDocument/2006/relationships" xmlns:m="http://schemas.openxmlformats.org/officeDocument/2006/math" xmlns:v="urn:schemas-microsoft-com:vml" xmlns:wp="http://schemas.openxmlformats.org/drawingml/2006/wordprocessingDrawing" xmlns:w10="urn:schemas-microsoft-com:office:word" xmlns:w="http://schemas.openxmlformats.org/wordprocessingml/2006/main" xmlns:wne="http://schemas.microsoft.com/office/word/2006/wordml">
+  <w:footnote w:type="separator" w:id="0">
     <w:p>
       <w:pPr>
         <w:spacing w:after="0" w:line="240" w:lineRule="auto"/>
@@ -575,7 +349,7 @@
       </w:r>
     </w:p>
   </w:footnote>
-  <w:footnote w:type="continuationSeparator" w:id="0">
+  <w:footnote w:type="continuationSeparator" w:id="1">
     <w:p>
       <w:pPr>
         <w:spacing w:after="0" w:line="240" w:lineRule="auto"/>
@@ -589,7 +363,7 @@
 </file>
 
 <file path=word/header1.xml><?xml version="1.0" encoding="utf-8"?>
-<w:hdr xmlns:wpc="http://schemas.microsoft.com/office/word/2010/wordprocessingCanvas" xmlns:cx="http://schemas.microsoft.com/office/drawing/2014/chartex" xmlns:cx1="http://schemas.microsoft.com/office/drawing/2015/9/8/chartex" xmlns:cx2="http://schemas.microsoft.com/office/drawing/2015/10/21/chartex" xmlns:cx3="http://schemas.microsoft.com/office/drawing/2016/5/9/chartex" xmlns:cx4="http://schemas.microsoft.com/office/drawing/2016/5/10/chartex" xmlns:cx5="http://schemas.microsoft.com/office/drawing/2016/5/11/chartex" xmlns:cx6="http://schemas.microsoft.com/office/drawing/2016/5/12/chartex" xmlns:cx7="http://schemas.microsoft.com/office/drawing/2016/5/13/chartex" xmlns:cx8="http://schemas.microsoft.com/office/drawing/2016/5/14/chartex" xmlns:mc="http://schemas.openxmlformats.org/markup-compatibility/2006" xmlns:aink="http://schemas.microsoft.com/office/drawing/2016/ink" xmlns:am3d="http://schemas.microsoft.com/office/drawing/2017/model3d" xmlns:o="urn:schemas-microsoft-com:office:office" xmlns:oel="http://schemas.microsoft.com/office/2019/extlst" xmlns:r="http://schemas.openxmlformats.org/officeDocument/2006/relationships" xmlns:m="http://schemas.openxmlformats.org/officeDocument/2006/math" xmlns:v="urn:schemas-microsoft-com:vml" xmlns:wp14="http://schemas.microsoft.com/office/word/2010/wordprocessingDrawing" xmlns:wp="http://schemas.openxmlformats.org/drawingml/2006/wordprocessingDrawing" xmlns:w10="urn:schemas-microsoft-com:office:word" xmlns:w="http://schemas.openxmlformats.org/wordprocessingml/2006/main" xmlns:w14="http://schemas.microsoft.com/office/word/2010/wordml" xmlns:w15="http://schemas.microsoft.com/office/word/2012/wordml" xmlns:w16cex="http://schemas.microsoft.com/office/word/2018/wordml/cex" xmlns:w16cid="http://schemas.microsoft.com/office/word/2016/wordml/cid" xmlns:w16="http://schemas.microsoft.com/office/word/2018/wordml" xmlns:w16du="http://schemas.microsoft.com/office/word/2023/wordml/word16du" xmlns:w16sdtdh="http://schemas.microsoft.com/office/word/2020/wordml/sdtdatahash" xmlns:w16sdtfl="http://schemas.microsoft.com/office/word/2024/wordml/sdtformatlock" xmlns:w16se="http://schemas.microsoft.com/office/word/2015/wordml/symex" xmlns:wpg="http://schemas.microsoft.com/office/word/2010/wordprocessingGroup" xmlns:wpi="http://schemas.microsoft.com/office/word/2010/wordprocessingInk" xmlns:wne="http://schemas.microsoft.com/office/word/2006/wordml" xmlns:wps="http://schemas.microsoft.com/office/word/2010/wordprocessingShape" mc:Ignorable="w14 w15 w16se w16cid w16 w16cex w16sdtdh w16sdtfl w16du wp14">
+<w:hdr xmlns:ve="http://schemas.openxmlformats.org/markup-compatibility/2006" xmlns:o="urn:schemas-microsoft-com:office:office" xmlns:r="http://schemas.openxmlformats.org/officeDocument/2006/relationships" xmlns:m="http://schemas.openxmlformats.org/officeDocument/2006/math" xmlns:v="urn:schemas-microsoft-com:vml" xmlns:wp="http://schemas.openxmlformats.org/drawingml/2006/wordprocessingDrawing" xmlns:w10="urn:schemas-microsoft-com:office:word" xmlns:w="http://schemas.openxmlformats.org/wordprocessingml/2006/main" xmlns:wne="http://schemas.microsoft.com/office/word/2006/wordml">
   <w:p>
     <w:pPr>
       <w:pStyle w:val="Header"/>
@@ -597,9 +371,10 @@
     <w:r>
       <w:rPr>
         <w:noProof/>
+        <w:lang w:val="en-US" w:eastAsia="en-US"/>
       </w:rPr>
       <w:drawing>
-        <wp:anchor distT="0" distB="0" distL="114300" distR="114300" simplePos="0" relativeHeight="251659264" behindDoc="1" locked="0" layoutInCell="1" allowOverlap="1" wp14:anchorId="2A09D8DC" wp14:editId="633478F2">
+        <wp:anchor distT="0" distB="0" distL="114300" distR="114300" simplePos="0" relativeHeight="251659264" behindDoc="1" locked="0" layoutInCell="1" allowOverlap="1">
           <wp:simplePos x="0" y="0"/>
           <wp:positionH relativeFrom="column">
             <wp:posOffset>-825500</wp:posOffset>
@@ -633,7 +408,7 @@
                   <a:blip r:embed="rId1">
                     <a:extLst>
                       <a:ext uri="{28A0092B-C50C-407E-A947-70E740481C1C}">
-                        <a14:useLocalDpi xmlns:a14="http://schemas.microsoft.com/office/drawing/2010/main" val="0"/>
+                        <a14:useLocalDpi xmlns:a14="http://schemas.microsoft.com/office/drawing/2010/main" xmlns:wps="http://schemas.microsoft.com/office/word/2010/wordprocessingShape" xmlns:wpi="http://schemas.microsoft.com/office/word/2010/wordprocessingInk" xmlns:wpg="http://schemas.microsoft.com/office/word/2010/wordprocessingGroup" xmlns:w16se="http://schemas.microsoft.com/office/word/2015/wordml/symex" xmlns:w16sdtfl="http://schemas.microsoft.com/office/word/2024/wordml/sdtformatlock" xmlns:w16sdtdh="http://schemas.microsoft.com/office/word/2020/wordml/sdtdatahash" xmlns:w16du="http://schemas.microsoft.com/office/word/2023/wordml/word16du" xmlns:w16="http://schemas.microsoft.com/office/word/2018/wordml" xmlns:w16cid="http://schemas.microsoft.com/office/word/2016/wordml/cid" xmlns:w16cex="http://schemas.microsoft.com/office/word/2018/wordml/cex" xmlns:w15="http://schemas.microsoft.com/office/word/2012/wordml" xmlns:w14="http://schemas.microsoft.com/office/word/2010/wordml" xmlns:w="http://schemas.openxmlformats.org/wordprocessingml/2006/main" xmlns:w10="urn:schemas-microsoft-com:office:word" xmlns:wp14="http://schemas.microsoft.com/office/word/2010/wordprocessingDrawing" xmlns:v="urn:schemas-microsoft-com:vml" xmlns:oel="http://schemas.microsoft.com/office/2019/extlst" xmlns:o="urn:schemas-microsoft-com:office:office" xmlns:am3d="http://schemas.microsoft.com/office/drawing/2017/model3d" xmlns:aink="http://schemas.microsoft.com/office/drawing/2016/ink" xmlns:mc="http://schemas.openxmlformats.org/markup-compatibility/2006" xmlns:cx8="http://schemas.microsoft.com/office/drawing/2016/5/14/chartex" xmlns:cx7="http://schemas.microsoft.com/office/drawing/2016/5/13/chartex" xmlns:cx6="http://schemas.microsoft.com/office/drawing/2016/5/12/chartex" xmlns:cx5="http://schemas.microsoft.com/office/drawing/2016/5/11/chartex" xmlns:cx4="http://schemas.microsoft.com/office/drawing/2016/5/10/chartex" xmlns:cx3="http://schemas.microsoft.com/office/drawing/2016/5/9/chartex" xmlns:cx2="http://schemas.microsoft.com/office/drawing/2015/10/21/chartex" xmlns:cx1="http://schemas.microsoft.com/office/drawing/2015/9/8/chartex" xmlns:cx="http://schemas.microsoft.com/office/drawing/2014/chartex" xmlns:wpc="http://schemas.microsoft.com/office/word/2010/wordprocessingCanvas" xmlns="" val="0"/>
                       </a:ext>
                     </a:extLst>
                   </a:blip>
@@ -653,21 +428,16 @@
               </pic:pic>
             </a:graphicData>
           </a:graphic>
-          <wp14:sizeRelH relativeFrom="margin">
-            <wp14:pctWidth>0</wp14:pctWidth>
-          </wp14:sizeRelH>
-          <wp14:sizeRelV relativeFrom="margin">
-            <wp14:pctHeight>0</wp14:pctHeight>
-          </wp14:sizeRelV>
         </wp:anchor>
       </w:drawing>
     </w:r>
     <w:r>
       <w:rPr>
         <w:noProof/>
+        <w:lang w:val="en-US" w:eastAsia="en-US"/>
       </w:rPr>
       <w:drawing>
-        <wp:anchor distT="0" distB="0" distL="114300" distR="114300" simplePos="0" relativeHeight="251658240" behindDoc="1" locked="0" layoutInCell="1" allowOverlap="1" wp14:anchorId="37972A62" wp14:editId="6D303C12">
+        <wp:anchor distT="0" distB="0" distL="114300" distR="114300" simplePos="0" relativeHeight="251658240" behindDoc="1" locked="0" layoutInCell="1" allowOverlap="1">
           <wp:simplePos x="0" y="0"/>
           <wp:positionH relativeFrom="column">
             <wp:posOffset>4819650</wp:posOffset>
@@ -701,7 +471,7 @@
                   <a:blip r:embed="rId2">
                     <a:extLst>
                       <a:ext uri="{28A0092B-C50C-407E-A947-70E740481C1C}">
-                        <a14:useLocalDpi xmlns:a14="http://schemas.microsoft.com/office/drawing/2010/main" val="0"/>
+                        <a14:useLocalDpi xmlns:a14="http://schemas.microsoft.com/office/drawing/2010/main" xmlns:wps="http://schemas.microsoft.com/office/word/2010/wordprocessingShape" xmlns:wpi="http://schemas.microsoft.com/office/word/2010/wordprocessingInk" xmlns:wpg="http://schemas.microsoft.com/office/word/2010/wordprocessingGroup" xmlns:w16se="http://schemas.microsoft.com/office/word/2015/wordml/symex" xmlns:w16sdtfl="http://schemas.microsoft.com/office/word/2024/wordml/sdtformatlock" xmlns:w16sdtdh="http://schemas.microsoft.com/office/word/2020/wordml/sdtdatahash" xmlns:w16du="http://schemas.microsoft.com/office/word/2023/wordml/word16du" xmlns:w16="http://schemas.microsoft.com/office/word/2018/wordml" xmlns:w16cid="http://schemas.microsoft.com/office/word/2016/wordml/cid" xmlns:w16cex="http://schemas.microsoft.com/office/word/2018/wordml/cex" xmlns:w15="http://schemas.microsoft.com/office/word/2012/wordml" xmlns:w14="http://schemas.microsoft.com/office/word/2010/wordml" xmlns:w="http://schemas.openxmlformats.org/wordprocessingml/2006/main" xmlns:w10="urn:schemas-microsoft-com:office:word" xmlns:wp14="http://schemas.microsoft.com/office/word/2010/wordprocessingDrawing" xmlns:v="urn:schemas-microsoft-com:vml" xmlns:oel="http://schemas.microsoft.com/office/2019/extlst" xmlns:o="urn:schemas-microsoft-com:office:office" xmlns:am3d="http://schemas.microsoft.com/office/drawing/2017/model3d" xmlns:aink="http://schemas.microsoft.com/office/drawing/2016/ink" xmlns:mc="http://schemas.openxmlformats.org/markup-compatibility/2006" xmlns:cx8="http://schemas.microsoft.com/office/drawing/2016/5/14/chartex" xmlns:cx7="http://schemas.microsoft.com/office/drawing/2016/5/13/chartex" xmlns:cx6="http://schemas.microsoft.com/office/drawing/2016/5/12/chartex" xmlns:cx5="http://schemas.microsoft.com/office/drawing/2016/5/11/chartex" xmlns:cx4="http://schemas.microsoft.com/office/drawing/2016/5/10/chartex" xmlns:cx3="http://schemas.microsoft.com/office/drawing/2016/5/9/chartex" xmlns:cx2="http://schemas.microsoft.com/office/drawing/2015/10/21/chartex" xmlns:cx1="http://schemas.microsoft.com/office/drawing/2015/9/8/chartex" xmlns:cx="http://schemas.microsoft.com/office/drawing/2014/chartex" xmlns:wpc="http://schemas.microsoft.com/office/word/2010/wordprocessingCanvas" xmlns="" val="0"/>
                       </a:ext>
                     </a:extLst>
                   </a:blip>
@@ -721,9 +491,6 @@
               </pic:pic>
             </a:graphicData>
           </a:graphic>
-          <wp14:sizeRelV relativeFrom="margin">
-            <wp14:pctHeight>0</wp14:pctHeight>
-          </wp14:sizeRelV>
         </wp:anchor>
       </w:drawing>
     </w:r>
@@ -732,7 +499,7 @@
 </file>
 
 <file path=word/styles.xml><?xml version="1.0" encoding="utf-8"?>
-<w:styles xmlns:mc="http://schemas.openxmlformats.org/markup-compatibility/2006" xmlns:r="http://schemas.openxmlformats.org/officeDocument/2006/relationships" xmlns:w="http://schemas.openxmlformats.org/wordprocessingml/2006/main" xmlns:w14="http://schemas.microsoft.com/office/word/2010/wordml" xmlns:w15="http://schemas.microsoft.com/office/word/2012/wordml" xmlns:w16cex="http://schemas.microsoft.com/office/word/2018/wordml/cex" xmlns:w16cid="http://schemas.microsoft.com/office/word/2016/wordml/cid" xmlns:w16="http://schemas.microsoft.com/office/word/2018/wordml" xmlns:w16du="http://schemas.microsoft.com/office/word/2023/wordml/word16du" xmlns:w16sdtdh="http://schemas.microsoft.com/office/word/2020/wordml/sdtdatahash" xmlns:w16sdtfl="http://schemas.microsoft.com/office/word/2024/wordml/sdtformatlock" xmlns:w16se="http://schemas.microsoft.com/office/word/2015/wordml/symex" mc:Ignorable="w14 w15 w16se w16cid w16 w16cex w16sdtdh w16sdtfl w16du">
+<w:styles xmlns:r="http://schemas.openxmlformats.org/officeDocument/2006/relationships" xmlns:w="http://schemas.openxmlformats.org/wordprocessingml/2006/main">
   <w:docDefaults>
     <w:rPrDefault>
       <w:rPr>
@@ -748,387 +515,149 @@
       </w:pPr>
     </w:pPrDefault>
   </w:docDefaults>
-  <w:latentStyles w:defLockedState="0" w:defUIPriority="99" w:defSemiHidden="0" w:defUnhideWhenUsed="0" w:defQFormat="0" w:count="376">
-    <w:lsdException w:name="Normal" w:uiPriority="0" w:qFormat="1"/>
-    <w:lsdException w:name="heading 1" w:uiPriority="9" w:qFormat="1"/>
-    <w:lsdException w:name="heading 2" w:semiHidden="1" w:uiPriority="9" w:unhideWhenUsed="1" w:qFormat="1"/>
-    <w:lsdException w:name="heading 3" w:semiHidden="1" w:uiPriority="9" w:unhideWhenUsed="1" w:qFormat="1"/>
-    <w:lsdException w:name="heading 4" w:semiHidden="1" w:uiPriority="9" w:unhideWhenUsed="1" w:qFormat="1"/>
-    <w:lsdException w:name="heading 5" w:semiHidden="1" w:uiPriority="9" w:unhideWhenUsed="1" w:qFormat="1"/>
-    <w:lsdException w:name="heading 6" w:semiHidden="1" w:uiPriority="9" w:unhideWhenUsed="1" w:qFormat="1"/>
-    <w:lsdException w:name="heading 7" w:semiHidden="1" w:uiPriority="9" w:unhideWhenUsed="1" w:qFormat="1"/>
-    <w:lsdException w:name="heading 8" w:semiHidden="1" w:uiPriority="9" w:unhideWhenUsed="1" w:qFormat="1"/>
-    <w:lsdException w:name="heading 9" w:semiHidden="1" w:uiPriority="9" w:unhideWhenUsed="1" w:qFormat="1"/>
-    <w:lsdException w:name="index 1" w:semiHidden="1" w:unhideWhenUsed="1"/>
-    <w:lsdException w:name="index 2" w:semiHidden="1" w:unhideWhenUsed="1"/>
-    <w:lsdException w:name="index 3" w:semiHidden="1" w:unhideWhenUsed="1"/>
-    <w:lsdException w:name="index 4" w:semiHidden="1" w:unhideWhenUsed="1"/>
-    <w:lsdException w:name="index 5" w:semiHidden="1" w:unhideWhenUsed="1"/>
-    <w:lsdException w:name="index 6" w:semiHidden="1" w:unhideWhenUsed="1"/>
-    <w:lsdException w:name="index 7" w:semiHidden="1" w:unhideWhenUsed="1"/>
-    <w:lsdException w:name="index 8" w:semiHidden="1" w:unhideWhenUsed="1"/>
-    <w:lsdException w:name="index 9" w:semiHidden="1" w:unhideWhenUsed="1"/>
-    <w:lsdException w:name="toc 1" w:semiHidden="1" w:uiPriority="39" w:unhideWhenUsed="1"/>
-    <w:lsdException w:name="toc 2" w:semiHidden="1" w:uiPriority="39" w:unhideWhenUsed="1"/>
-    <w:lsdException w:name="toc 3" w:semiHidden="1" w:uiPriority="39" w:unhideWhenUsed="1"/>
-    <w:lsdException w:name="toc 4" w:semiHidden="1" w:uiPriority="39" w:unhideWhenUsed="1"/>
-    <w:lsdException w:name="toc 5" w:semiHidden="1" w:uiPriority="39" w:unhideWhenUsed="1"/>
-    <w:lsdException w:name="toc 6" w:semiHidden="1" w:uiPriority="39" w:unhideWhenUsed="1"/>
-    <w:lsdException w:name="toc 7" w:semiHidden="1" w:uiPriority="39" w:unhideWhenUsed="1"/>
-    <w:lsdException w:name="toc 8" w:semiHidden="1" w:uiPriority="39" w:unhideWhenUsed="1"/>
-    <w:lsdException w:name="toc 9" w:semiHidden="1" w:uiPriority="39" w:unhideWhenUsed="1"/>
-    <w:lsdException w:name="Normal Indent" w:semiHidden="1" w:unhideWhenUsed="1"/>
-    <w:lsdException w:name="footnote text" w:semiHidden="1" w:unhideWhenUsed="1"/>
-    <w:lsdException w:name="annotation text" w:semiHidden="1" w:unhideWhenUsed="1"/>
-    <w:lsdException w:name="header" w:semiHidden="1" w:unhideWhenUsed="1"/>
-    <w:lsdException w:name="footer" w:semiHidden="1" w:unhideWhenUsed="1"/>
-    <w:lsdException w:name="index heading" w:semiHidden="1" w:unhideWhenUsed="1"/>
-    <w:lsdException w:name="caption" w:semiHidden="1" w:uiPriority="35" w:unhideWhenUsed="1" w:qFormat="1"/>
-    <w:lsdException w:name="table of figures" w:semiHidden="1" w:unhideWhenUsed="1"/>
-    <w:lsdException w:name="envelope address" w:semiHidden="1" w:unhideWhenUsed="1"/>
-    <w:lsdException w:name="envelope return" w:semiHidden="1" w:unhideWhenUsed="1"/>
-    <w:lsdException w:name="footnote reference" w:semiHidden="1" w:unhideWhenUsed="1"/>
-    <w:lsdException w:name="annotation reference" w:semiHidden="1" w:unhideWhenUsed="1"/>
-    <w:lsdException w:name="line number" w:semiHidden="1" w:unhideWhenUsed="1"/>
-    <w:lsdException w:name="page number" w:semiHidden="1" w:unhideWhenUsed="1"/>
-    <w:lsdException w:name="endnote reference" w:semiHidden="1" w:unhideWhenUsed="1"/>
-    <w:lsdException w:name="endnote text" w:semiHidden="1" w:unhideWhenUsed="1"/>
-    <w:lsdException w:name="table of authorities" w:semiHidden="1" w:unhideWhenUsed="1"/>
-    <w:lsdException w:name="macro" w:semiHidden="1" w:unhideWhenUsed="1"/>
-    <w:lsdException w:name="toa heading" w:semiHidden="1" w:unhideWhenUsed="1"/>
-    <w:lsdException w:name="List" w:semiHidden="1" w:unhideWhenUsed="1"/>
-    <w:lsdException w:name="List Bullet" w:semiHidden="1" w:unhideWhenUsed="1"/>
-    <w:lsdException w:name="List Number" w:semiHidden="1" w:unhideWhenUsed="1"/>
-    <w:lsdException w:name="List 2" w:semiHidden="1" w:unhideWhenUsed="1"/>
-    <w:lsdException w:name="List 3" w:semiHidden="1" w:unhideWhenUsed="1"/>
-    <w:lsdException w:name="List 4" w:semiHidden="1" w:unhideWhenUsed="1"/>
-    <w:lsdException w:name="List 5" w:semiHidden="1" w:unhideWhenUsed="1"/>
-    <w:lsdException w:name="List Bullet 2" w:semiHidden="1" w:unhideWhenUsed="1"/>
-    <w:lsdException w:name="List Bullet 3" w:semiHidden="1" w:unhideWhenUsed="1"/>
-    <w:lsdException w:name="List Bullet 4" w:semiHidden="1" w:unhideWhenUsed="1"/>
-    <w:lsdException w:name="List Bullet 5" w:semiHidden="1" w:unhideWhenUsed="1"/>
-    <w:lsdException w:name="List Number 2" w:semiHidden="1" w:unhideWhenUsed="1"/>
-    <w:lsdException w:name="List Number 3" w:semiHidden="1" w:unhideWhenUsed="1"/>
-    <w:lsdException w:name="List Number 4" w:semiHidden="1" w:unhideWhenUsed="1"/>
-    <w:lsdException w:name="List Number 5" w:semiHidden="1" w:unhideWhenUsed="1"/>
-    <w:lsdException w:name="Title" w:uiPriority="10" w:qFormat="1"/>
-    <w:lsdException w:name="Closing" w:semiHidden="1" w:unhideWhenUsed="1"/>
-    <w:lsdException w:name="Signature" w:semiHidden="1" w:unhideWhenUsed="1"/>
-    <w:lsdException w:name="Default Paragraph Font" w:semiHidden="1" w:uiPriority="1" w:unhideWhenUsed="1"/>
-    <w:lsdException w:name="Body Text" w:semiHidden="1" w:unhideWhenUsed="1"/>
-    <w:lsdException w:name="Body Text Indent" w:semiHidden="1" w:unhideWhenUsed="1"/>
-    <w:lsdException w:name="List Continue" w:semiHidden="1" w:unhideWhenUsed="1"/>
-    <w:lsdException w:name="List Continue 2" w:semiHidden="1" w:unhideWhenUsed="1"/>
-    <w:lsdException w:name="List Continue 3" w:semiHidden="1" w:unhideWhenUsed="1"/>
-    <w:lsdException w:name="List Continue 4" w:semiHidden="1" w:unhideWhenUsed="1"/>
-    <w:lsdException w:name="List Continue 5" w:semiHidden="1" w:unhideWhenUsed="1"/>
-    <w:lsdException w:name="Message Header" w:semiHidden="1" w:unhideWhenUsed="1"/>
-    <w:lsdException w:name="Subtitle" w:uiPriority="11" w:qFormat="1"/>
-    <w:lsdException w:name="Salutation" w:semiHidden="1" w:unhideWhenUsed="1"/>
-    <w:lsdException w:name="Date" w:semiHidden="1" w:unhideWhenUsed="1"/>
-    <w:lsdException w:name="Body Text First Indent" w:semiHidden="1" w:unhideWhenUsed="1"/>
-    <w:lsdException w:name="Body Text First Indent 2" w:semiHidden="1" w:unhideWhenUsed="1"/>
-    <w:lsdException w:name="Note Heading" w:semiHidden="1" w:unhideWhenUsed="1"/>
-    <w:lsdException w:name="Body Text 2" w:semiHidden="1" w:unhideWhenUsed="1"/>
-    <w:lsdException w:name="Body Text 3" w:semiHidden="1" w:unhideWhenUsed="1"/>
-    <w:lsdException w:name="Body Text Indent 2" w:semiHidden="1" w:unhideWhenUsed="1"/>
-    <w:lsdException w:name="Body Text Indent 3" w:semiHidden="1" w:unhideWhenUsed="1"/>
-    <w:lsdException w:name="Block Text" w:semiHidden="1" w:unhideWhenUsed="1"/>
-    <w:lsdException w:name="Hyperlink" w:semiHidden="1" w:unhideWhenUsed="1"/>
-    <w:lsdException w:name="FollowedHyperlink" w:semiHidden="1" w:unhideWhenUsed="1"/>
-    <w:lsdException w:name="Strong" w:uiPriority="22" w:qFormat="1"/>
-    <w:lsdException w:name="Emphasis" w:uiPriority="20" w:qFormat="1"/>
-    <w:lsdException w:name="Document Map" w:semiHidden="1" w:unhideWhenUsed="1"/>
-    <w:lsdException w:name="Plain Text" w:semiHidden="1" w:unhideWhenUsed="1"/>
-    <w:lsdException w:name="E-mail Signature" w:semiHidden="1" w:unhideWhenUsed="1"/>
-    <w:lsdException w:name="HTML Top of Form" w:semiHidden="1" w:unhideWhenUsed="1"/>
-    <w:lsdException w:name="HTML Bottom of Form" w:semiHidden="1" w:unhideWhenUsed="1"/>
-    <w:lsdException w:name="Normal (Web)" w:semiHidden="1" w:unhideWhenUsed="1"/>
-    <w:lsdException w:name="HTML Acronym" w:semiHidden="1" w:unhideWhenUsed="1"/>
-    <w:lsdException w:name="HTML Address" w:semiHidden="1" w:unhideWhenUsed="1"/>
-    <w:lsdException w:name="HTML Cite" w:semiHidden="1" w:unhideWhenUsed="1"/>
-    <w:lsdException w:name="HTML Code" w:semiHidden="1" w:unhideWhenUsed="1"/>
-    <w:lsdException w:name="HTML Definition" w:semiHidden="1" w:unhideWhenUsed="1"/>
-    <w:lsdException w:name="HTML Keyboard" w:semiHidden="1" w:unhideWhenUsed="1"/>
-    <w:lsdException w:name="HTML Preformatted" w:semiHidden="1" w:unhideWhenUsed="1"/>
-    <w:lsdException w:name="HTML Sample" w:semiHidden="1" w:unhideWhenUsed="1"/>
-    <w:lsdException w:name="HTML Typewriter" w:semiHidden="1" w:unhideWhenUsed="1"/>
-    <w:lsdException w:name="HTML Variable" w:semiHidden="1" w:unhideWhenUsed="1"/>
-    <w:lsdException w:name="Normal Table" w:semiHidden="1" w:unhideWhenUsed="1"/>
-    <w:lsdException w:name="annotation subject" w:semiHidden="1" w:unhideWhenUsed="1"/>
-    <w:lsdException w:name="No List" w:semiHidden="1" w:unhideWhenUsed="1"/>
-    <w:lsdException w:name="Outline List 1" w:semiHidden="1" w:unhideWhenUsed="1"/>
-    <w:lsdException w:name="Outline List 2" w:semiHidden="1" w:unhideWhenUsed="1"/>
-    <w:lsdException w:name="Outline List 3" w:semiHidden="1" w:unhideWhenUsed="1"/>
-    <w:lsdException w:name="Table Simple 1" w:semiHidden="1" w:unhideWhenUsed="1"/>
-    <w:lsdException w:name="Table Simple 2" w:semiHidden="1" w:unhideWhenUsed="1"/>
-    <w:lsdException w:name="Table Simple 3" w:semiHidden="1" w:unhideWhenUsed="1"/>
-    <w:lsdException w:name="Table Classic 1" w:semiHidden="1" w:unhideWhenUsed="1"/>
-    <w:lsdException w:name="Table Classic 2" w:semiHidden="1" w:unhideWhenUsed="1"/>
-    <w:lsdException w:name="Table Classic 3" w:semiHidden="1" w:unhideWhenUsed="1"/>
-    <w:lsdException w:name="Table Classic 4" w:semiHidden="1" w:unhideWhenUsed="1"/>
-    <w:lsdException w:name="Table Colorful 1" w:semiHidden="1" w:unhideWhenUsed="1"/>
-    <w:lsdException w:name="Table Colorful 2" w:semiHidden="1" w:unhideWhenUsed="1"/>
-    <w:lsdException w:name="Table Colorful 3" w:semiHidden="1" w:unhideWhenUsed="1"/>
-    <w:lsdException w:name="Table Columns 1" w:semiHidden="1" w:unhideWhenUsed="1"/>
-    <w:lsdException w:name="Table Columns 2" w:semiHidden="1" w:unhideWhenUsed="1"/>
-    <w:lsdException w:name="Table Columns 3" w:semiHidden="1" w:unhideWhenUsed="1"/>
-    <w:lsdException w:name="Table Columns 4" w:semiHidden="1" w:unhideWhenUsed="1"/>
-    <w:lsdException w:name="Table Columns 5" w:semiHidden="1" w:unhideWhenUsed="1"/>
-    <w:lsdException w:name="Table Grid 1" w:semiHidden="1" w:unhideWhenUsed="1"/>
-    <w:lsdException w:name="Table Grid 2" w:semiHidden="1" w:unhideWhenUsed="1"/>
-    <w:lsdException w:name="Table Grid 3" w:semiHidden="1" w:unhideWhenUsed="1"/>
-    <w:lsdException w:name="Table Grid 4" w:semiHidden="1" w:unhideWhenUsed="1"/>
-    <w:lsdException w:name="Table Grid 5" w:semiHidden="1" w:unhideWhenUsed="1"/>
-    <w:lsdException w:name="Table Grid 6" w:semiHidden="1" w:unhideWhenUsed="1"/>
-    <w:lsdException w:name="Table Grid 7" w:semiHidden="1" w:unhideWhenUsed="1"/>
-    <w:lsdException w:name="Table Grid 8" w:semiHidden="1" w:unhideWhenUsed="1"/>
-    <w:lsdException w:name="Table List 1" w:semiHidden="1" w:unhideWhenUsed="1"/>
-    <w:lsdException w:name="Table List 2" w:semiHidden="1" w:unhideWhenUsed="1"/>
-    <w:lsdException w:name="Table List 3" w:semiHidden="1" w:unhideWhenUsed="1"/>
-    <w:lsdException w:name="Table List 4" w:semiHidden="1" w:unhideWhenUsed="1"/>
-    <w:lsdException w:name="Table List 5" w:semiHidden="1" w:unhideWhenUsed="1"/>
-    <w:lsdException w:name="Table List 6" w:semiHidden="1" w:unhideWhenUsed="1"/>
-    <w:lsdException w:name="Table List 7" w:semiHidden="1" w:unhideWhenUsed="1"/>
-    <w:lsdException w:name="Table List 8" w:semiHidden="1" w:unhideWhenUsed="1"/>
-    <w:lsdException w:name="Table 3D effects 1" w:semiHidden="1" w:unhideWhenUsed="1"/>
-    <w:lsdException w:name="Table 3D effects 2" w:semiHidden="1" w:unhideWhenUsed="1"/>
-    <w:lsdException w:name="Table 3D effects 3" w:semiHidden="1" w:unhideWhenUsed="1"/>
-    <w:lsdException w:name="Table Contemporary" w:semiHidden="1" w:unhideWhenUsed="1"/>
-    <w:lsdException w:name="Table Elegant" w:semiHidden="1" w:unhideWhenUsed="1"/>
-    <w:lsdException w:name="Table Professional" w:semiHidden="1" w:unhideWhenUsed="1"/>
-    <w:lsdException w:name="Table Subtle 1" w:semiHidden="1" w:unhideWhenUsed="1"/>
-    <w:lsdException w:name="Table Subtle 2" w:semiHidden="1" w:unhideWhenUsed="1"/>
-    <w:lsdException w:name="Table Web 1" w:semiHidden="1" w:unhideWhenUsed="1"/>
-    <w:lsdException w:name="Table Web 2" w:semiHidden="1" w:unhideWhenUsed="1"/>
-    <w:lsdException w:name="Table Web 3" w:semiHidden="1" w:unhideWhenUsed="1"/>
-    <w:lsdException w:name="Balloon Text" w:semiHidden="1" w:unhideWhenUsed="1"/>
-    <w:lsdException w:name="Table Grid" w:uiPriority="39"/>
-    <w:lsdException w:name="Table Theme" w:semiHidden="1" w:unhideWhenUsed="1"/>
-    <w:lsdException w:name="Placeholder Text" w:semiHidden="1"/>
-    <w:lsdException w:name="No Spacing" w:uiPriority="1" w:qFormat="1"/>
-    <w:lsdException w:name="Light Shading" w:uiPriority="60"/>
-    <w:lsdException w:name="Light List" w:uiPriority="61"/>
-    <w:lsdException w:name="Light Grid" w:uiPriority="62"/>
-    <w:lsdException w:name="Medium Shading 1" w:uiPriority="63"/>
-    <w:lsdException w:name="Medium Shading 2" w:uiPriority="64"/>
-    <w:lsdException w:name="Medium List 1" w:uiPriority="65"/>
-    <w:lsdException w:name="Medium List 2" w:uiPriority="66"/>
-    <w:lsdException w:name="Medium Grid 1" w:uiPriority="67"/>
-    <w:lsdException w:name="Medium Grid 2" w:uiPriority="68"/>
-    <w:lsdException w:name="Medium Grid 3" w:uiPriority="69"/>
-    <w:lsdException w:name="Dark List" w:uiPriority="70"/>
-    <w:lsdException w:name="Colorful Shading" w:uiPriority="71"/>
-    <w:lsdException w:name="Colorful List" w:uiPriority="72"/>
-    <w:lsdException w:name="Colorful Grid" w:uiPriority="73"/>
-    <w:lsdException w:name="Light Shading Accent 1" w:uiPriority="60"/>
-    <w:lsdException w:name="Light List Accent 1" w:uiPriority="61"/>
-    <w:lsdException w:name="Light Grid Accent 1" w:uiPriority="62"/>
-    <w:lsdException w:name="Medium Shading 1 Accent 1" w:uiPriority="63"/>
-    <w:lsdException w:name="Medium Shading 2 Accent 1" w:uiPriority="64"/>
-    <w:lsdException w:name="Medium List 1 Accent 1" w:uiPriority="65"/>
-    <w:lsdException w:name="Revision" w:semiHidden="1"/>
-    <w:lsdException w:name="List Paragraph" w:uiPriority="34" w:qFormat="1"/>
-    <w:lsdException w:name="Quote" w:uiPriority="29" w:qFormat="1"/>
-    <w:lsdException w:name="Intense Quote" w:uiPriority="30" w:qFormat="1"/>
-    <w:lsdException w:name="Medium List 2 Accent 1" w:uiPriority="66"/>
-    <w:lsdException w:name="Medium Grid 1 Accent 1" w:uiPriority="67"/>
-    <w:lsdException w:name="Medium Grid 2 Accent 1" w:uiPriority="68"/>
-    <w:lsdException w:name="Medium Grid 3 Accent 1" w:uiPriority="69"/>
-    <w:lsdException w:name="Dark List Accent 1" w:uiPriority="70"/>
-    <w:lsdException w:name="Colorful Shading Accent 1" w:uiPriority="71"/>
-    <w:lsdException w:name="Colorful List Accent 1" w:uiPriority="72"/>
-    <w:lsdException w:name="Colorful Grid Accent 1" w:uiPriority="73"/>
-    <w:lsdException w:name="Light Shading Accent 2" w:uiPriority="60"/>
-    <w:lsdException w:name="Light List Accent 2" w:uiPriority="61"/>
-    <w:lsdException w:name="Light Grid Accent 2" w:uiPriority="62"/>
-    <w:lsdException w:name="Medium Shading 1 Accent 2" w:uiPriority="63"/>
-    <w:lsdException w:name="Medium Shading 2 Accent 2" w:uiPriority="64"/>
-    <w:lsdException w:name="Medium List 1 Accent 2" w:uiPriority="65"/>
-    <w:lsdException w:name="Medium List 2 Accent 2" w:uiPriority="66"/>
-    <w:lsdException w:name="Medium Grid 1 Accent 2" w:uiPriority="67"/>
-    <w:lsdException w:name="Medium Grid 2 Accent 2" w:uiPriority="68"/>
-    <w:lsdException w:name="Medium Grid 3 Accent 2" w:uiPriority="69"/>
-    <w:lsdException w:name="Dark List Accent 2" w:uiPriority="70"/>
-    <w:lsdException w:name="Colorful Shading Accent 2" w:uiPriority="71"/>
-    <w:lsdException w:name="Colorful List Accent 2" w:uiPriority="72"/>
-    <w:lsdException w:name="Colorful Grid Accent 2" w:uiPriority="73"/>
-    <w:lsdException w:name="Light Shading Accent 3" w:uiPriority="60"/>
-    <w:lsdException w:name="Light List Accent 3" w:uiPriority="61"/>
-    <w:lsdException w:name="Light Grid Accent 3" w:uiPriority="62"/>
-    <w:lsdException w:name="Medium Shading 1 Accent 3" w:uiPriority="63"/>
-    <w:lsdException w:name="Medium Shading 2 Accent 3" w:uiPriority="64"/>
-    <w:lsdException w:name="Medium List 1 Accent 3" w:uiPriority="65"/>
-    <w:lsdException w:name="Medium List 2 Accent 3" w:uiPriority="66"/>
-    <w:lsdException w:name="Medium Grid 1 Accent 3" w:uiPriority="67"/>
-    <w:lsdException w:name="Medium Grid 2 Accent 3" w:uiPriority="68"/>
-    <w:lsdException w:name="Medium Grid 3 Accent 3" w:uiPriority="69"/>
-    <w:lsdException w:name="Dark List Accent 3" w:uiPriority="70"/>
-    <w:lsdException w:name="Colorful Shading Accent 3" w:uiPriority="71"/>
-    <w:lsdException w:name="Colorful List Accent 3" w:uiPriority="72"/>
-    <w:lsdException w:name="Colorful Grid Accent 3" w:uiPriority="73"/>
-    <w:lsdException w:name="Light Shading Accent 4" w:uiPriority="60"/>
-    <w:lsdException w:name="Light List Accent 4" w:uiPriority="61"/>
-    <w:lsdException w:name="Light Grid Accent 4" w:uiPriority="62"/>
-    <w:lsdException w:name="Medium Shading 1 Accent 4" w:uiPriority="63"/>
-    <w:lsdException w:name="Medium Shading 2 Accent 4" w:uiPriority="64"/>
-    <w:lsdException w:name="Medium List 1 Accent 4" w:uiPriority="65"/>
-    <w:lsdException w:name="Medium List 2 Accent 4" w:uiPriority="66"/>
-    <w:lsdException w:name="Medium Grid 1 Accent 4" w:uiPriority="67"/>
-    <w:lsdException w:name="Medium Grid 2 Accent 4" w:uiPriority="68"/>
-    <w:lsdException w:name="Medium Grid 3 Accent 4" w:uiPriority="69"/>
-    <w:lsdException w:name="Dark List Accent 4" w:uiPriority="70"/>
-    <w:lsdException w:name="Colorful Shading Accent 4" w:uiPriority="71"/>
-    <w:lsdException w:name="Colorful List Accent 4" w:uiPriority="72"/>
-    <w:lsdException w:name="Colorful Grid Accent 4" w:uiPriority="73"/>
-    <w:lsdException w:name="Light Shading Accent 5" w:uiPriority="60"/>
-    <w:lsdException w:name="Light List Accent 5" w:uiPriority="61"/>
-    <w:lsdException w:name="Light Grid Accent 5" w:uiPriority="62"/>
-    <w:lsdException w:name="Medium Shading 1 Accent 5" w:uiPriority="63"/>
-    <w:lsdException w:name="Medium Shading 2 Accent 5" w:uiPriority="64"/>
-    <w:lsdException w:name="Medium List 1 Accent 5" w:uiPriority="65"/>
-    <w:lsdException w:name="Medium List 2 Accent 5" w:uiPriority="66"/>
-    <w:lsdException w:name="Medium Grid 1 Accent 5" w:uiPriority="67"/>
-    <w:lsdException w:name="Medium Grid 2 Accent 5" w:uiPriority="68"/>
-    <w:lsdException w:name="Medium Grid 3 Accent 5" w:uiPriority="69"/>
-    <w:lsdException w:name="Dark List Accent 5" w:uiPriority="70"/>
-    <w:lsdException w:name="Colorful Shading Accent 5" w:uiPriority="71"/>
-    <w:lsdException w:name="Colorful List Accent 5" w:uiPriority="72"/>
-    <w:lsdException w:name="Colorful Grid Accent 5" w:uiPriority="73"/>
-    <w:lsdException w:name="Light Shading Accent 6" w:uiPriority="60"/>
-    <w:lsdException w:name="Light List Accent 6" w:uiPriority="61"/>
-    <w:lsdException w:name="Light Grid Accent 6" w:uiPriority="62"/>
-    <w:lsdException w:name="Medium Shading 1 Accent 6" w:uiPriority="63"/>
-    <w:lsdException w:name="Medium Shading 2 Accent 6" w:uiPriority="64"/>
-    <w:lsdException w:name="Medium List 1 Accent 6" w:uiPriority="65"/>
-    <w:lsdException w:name="Medium List 2 Accent 6" w:uiPriority="66"/>
-    <w:lsdException w:name="Medium Grid 1 Accent 6" w:uiPriority="67"/>
-    <w:lsdException w:name="Medium Grid 2 Accent 6" w:uiPriority="68"/>
-    <w:lsdException w:name="Medium Grid 3 Accent 6" w:uiPriority="69"/>
-    <w:lsdException w:name="Dark List Accent 6" w:uiPriority="70"/>
-    <w:lsdException w:name="Colorful Shading Accent 6" w:uiPriority="71"/>
-    <w:lsdException w:name="Colorful List Accent 6" w:uiPriority="72"/>
-    <w:lsdException w:name="Colorful Grid Accent 6" w:uiPriority="73"/>
-    <w:lsdException w:name="Subtle Emphasis" w:uiPriority="19" w:qFormat="1"/>
-    <w:lsdException w:name="Intense Emphasis" w:uiPriority="21" w:qFormat="1"/>
-    <w:lsdException w:name="Subtle Reference" w:uiPriority="31" w:qFormat="1"/>
-    <w:lsdException w:name="Intense Reference" w:uiPriority="32" w:qFormat="1"/>
-    <w:lsdException w:name="Book Title" w:uiPriority="33" w:qFormat="1"/>
-    <w:lsdException w:name="Bibliography" w:semiHidden="1" w:uiPriority="37" w:unhideWhenUsed="1"/>
-    <w:lsdException w:name="TOC Heading" w:semiHidden="1" w:uiPriority="39" w:unhideWhenUsed="1" w:qFormat="1"/>
-    <w:lsdException w:name="Plain Table 1" w:uiPriority="41"/>
-    <w:lsdException w:name="Plain Table 2" w:uiPriority="42"/>
-    <w:lsdException w:name="Plain Table 3" w:uiPriority="43"/>
-    <w:lsdException w:name="Plain Table 4" w:uiPriority="44"/>
-    <w:lsdException w:name="Plain Table 5" w:uiPriority="45"/>
-    <w:lsdException w:name="Grid Table Light" w:uiPriority="40"/>
-    <w:lsdException w:name="Grid Table 1 Light" w:uiPriority="46"/>
-    <w:lsdException w:name="Grid Table 2" w:uiPriority="47"/>
-    <w:lsdException w:name="Grid Table 3" w:uiPriority="48"/>
-    <w:lsdException w:name="Grid Table 4" w:uiPriority="49"/>
-    <w:lsdException w:name="Grid Table 5 Dark" w:uiPriority="50"/>
-    <w:lsdException w:name="Grid Table 6 Colorful" w:uiPriority="51"/>
-    <w:lsdException w:name="Grid Table 7 Colorful" w:uiPriority="52"/>
-    <w:lsdException w:name="Grid Table 1 Light Accent 1" w:uiPriority="46"/>
-    <w:lsdException w:name="Grid Table 2 Accent 1" w:uiPriority="47"/>
-    <w:lsdException w:name="Grid Table 3 Accent 1" w:uiPriority="48"/>
-    <w:lsdException w:name="Grid Table 4 Accent 1" w:uiPriority="49"/>
-    <w:lsdException w:name="Grid Table 5 Dark Accent 1" w:uiPriority="50"/>
-    <w:lsdException w:name="Grid Table 6 Colorful Accent 1" w:uiPriority="51"/>
-    <w:lsdException w:name="Grid Table 7 Colorful Accent 1" w:uiPriority="52"/>
-    <w:lsdException w:name="Grid Table 1 Light Accent 2" w:uiPriority="46"/>
-    <w:lsdException w:name="Grid Table 2 Accent 2" w:uiPriority="47"/>
-    <w:lsdException w:name="Grid Table 3 Accent 2" w:uiPriority="48"/>
-    <w:lsdException w:name="Grid Table 4 Accent 2" w:uiPriority="49"/>
-    <w:lsdException w:name="Grid Table 5 Dark Accent 2" w:uiPriority="50"/>
-    <w:lsdException w:name="Grid Table 6 Colorful Accent 2" w:uiPriority="51"/>
-    <w:lsdException w:name="Grid Table 7 Colorful Accent 2" w:uiPriority="52"/>
-    <w:lsdException w:name="Grid Table 1 Light Accent 3" w:uiPriority="46"/>
-    <w:lsdException w:name="Grid Table 2 Accent 3" w:uiPriority="47"/>
-    <w:lsdException w:name="Grid Table 3 Accent 3" w:uiPriority="48"/>
-    <w:lsdException w:name="Grid Table 4 Accent 3" w:uiPriority="49"/>
-    <w:lsdException w:name="Grid Table 5 Dark Accent 3" w:uiPriority="50"/>
-    <w:lsdException w:name="Grid Table 6 Colorful Accent 3" w:uiPriority="51"/>
-    <w:lsdException w:name="Grid Table 7 Colorful Accent 3" w:uiPriority="52"/>
-    <w:lsdException w:name="Grid Table 1 Light Accent 4" w:uiPriority="46"/>
-    <w:lsdException w:name="Grid Table 2 Accent 4" w:uiPriority="47"/>
-    <w:lsdException w:name="Grid Table 3 Accent 4" w:uiPriority="48"/>
-    <w:lsdException w:name="Grid Table 4 Accent 4" w:uiPriority="49"/>
-    <w:lsdException w:name="Grid Table 5 Dark Accent 4" w:uiPriority="50"/>
-    <w:lsdException w:name="Grid Table 6 Colorful Accent 4" w:uiPriority="51"/>
-    <w:lsdException w:name="Grid Table 7 Colorful Accent 4" w:uiPriority="52"/>
-    <w:lsdException w:name="Grid Table 1 Light Accent 5" w:uiPriority="46"/>
-    <w:lsdException w:name="Grid Table 2 Accent 5" w:uiPriority="47"/>
-    <w:lsdException w:name="Grid Table 3 Accent 5" w:uiPriority="48"/>
-    <w:lsdException w:name="Grid Table 4 Accent 5" w:uiPriority="49"/>
-    <w:lsdException w:name="Grid Table 5 Dark Accent 5" w:uiPriority="50"/>
-    <w:lsdException w:name="Grid Table 6 Colorful Accent 5" w:uiPriority="51"/>
-    <w:lsdException w:name="Grid Table 7 Colorful Accent 5" w:uiPriority="52"/>
-    <w:lsdException w:name="Grid Table 1 Light Accent 6" w:uiPriority="46"/>
-    <w:lsdException w:name="Grid Table 2 Accent 6" w:uiPriority="47"/>
-    <w:lsdException w:name="Grid Table 3 Accent 6" w:uiPriority="48"/>
-    <w:lsdException w:name="Grid Table 4 Accent 6" w:uiPriority="49"/>
-    <w:lsdException w:name="Grid Table 5 Dark Accent 6" w:uiPriority="50"/>
-    <w:lsdException w:name="Grid Table 6 Colorful Accent 6" w:uiPriority="51"/>
-    <w:lsdException w:name="Grid Table 7 Colorful Accent 6" w:uiPriority="52"/>
-    <w:lsdException w:name="List Table 1 Light" w:uiPriority="46"/>
-    <w:lsdException w:name="List Table 2" w:uiPriority="47"/>
-    <w:lsdException w:name="List Table 3" w:uiPriority="48"/>
-    <w:lsdException w:name="List Table 4" w:uiPriority="49"/>
-    <w:lsdException w:name="List Table 5 Dark" w:uiPriority="50"/>
-    <w:lsdException w:name="List Table 6 Colorful" w:uiPriority="51"/>
-    <w:lsdException w:name="List Table 7 Colorful" w:uiPriority="52"/>
-    <w:lsdException w:name="List Table 1 Light Accent 1" w:uiPriority="46"/>
-    <w:lsdException w:name="List Table 2 Accent 1" w:uiPriority="47"/>
-    <w:lsdException w:name="List Table 3 Accent 1" w:uiPriority="48"/>
-    <w:lsdException w:name="List Table 4 Accent 1" w:uiPriority="49"/>
-    <w:lsdException w:name="List Table 5 Dark Accent 1" w:uiPriority="50"/>
-    <w:lsdException w:name="List Table 6 Colorful Accent 1" w:uiPriority="51"/>
-    <w:lsdException w:name="List Table 7 Colorful Accent 1" w:uiPriority="52"/>
-    <w:lsdException w:name="List Table 1 Light Accent 2" w:uiPriority="46"/>
-    <w:lsdException w:name="List Table 2 Accent 2" w:uiPriority="47"/>
-    <w:lsdException w:name="List Table 3 Accent 2" w:uiPriority="48"/>
-    <w:lsdException w:name="List Table 4 Accent 2" w:uiPriority="49"/>
-    <w:lsdException w:name="List Table 5 Dark Accent 2" w:uiPriority="50"/>
-    <w:lsdException w:name="List Table 6 Colorful Accent 2" w:uiPriority="51"/>
-    <w:lsdException w:name="List Table 7 Colorful Accent 2" w:uiPriority="52"/>
-    <w:lsdException w:name="List Table 1 Light Accent 3" w:uiPriority="46"/>
-    <w:lsdException w:name="List Table 2 Accent 3" w:uiPriority="47"/>
-    <w:lsdException w:name="List Table 3 Accent 3" w:uiPriority="48"/>
-    <w:lsdException w:name="List Table 4 Accent 3" w:uiPriority="49"/>
-    <w:lsdException w:name="List Table 5 Dark Accent 3" w:uiPriority="50"/>
-    <w:lsdException w:name="List Table 6 Colorful Accent 3" w:uiPriority="51"/>
-    <w:lsdException w:name="List Table 7 Colorful Accent 3" w:uiPriority="52"/>
-    <w:lsdException w:name="List Table 1 Light Accent 4" w:uiPriority="46"/>
-    <w:lsdException w:name="List Table 2 Accent 4" w:uiPriority="47"/>
-    <w:lsdException w:name="List Table 3 Accent 4" w:uiPriority="48"/>
-    <w:lsdException w:name="List Table 4 Accent 4" w:uiPriority="49"/>
-    <w:lsdException w:name="List Table 5 Dark Accent 4" w:uiPriority="50"/>
-    <w:lsdException w:name="List Table 6 Colorful Accent 4" w:uiPriority="51"/>
-    <w:lsdException w:name="List Table 7 Colorful Accent 4" w:uiPriority="52"/>
-    <w:lsdException w:name="List Table 1 Light Accent 5" w:uiPriority="46"/>
-    <w:lsdException w:name="List Table 2 Accent 5" w:uiPriority="47"/>
-    <w:lsdException w:name="List Table 3 Accent 5" w:uiPriority="48"/>
-    <w:lsdException w:name="List Table 4 Accent 5" w:uiPriority="49"/>
-    <w:lsdException w:name="List Table 5 Dark Accent 5" w:uiPriority="50"/>
-    <w:lsdException w:name="List Table 6 Colorful Accent 5" w:uiPriority="51"/>
-    <w:lsdException w:name="List Table 7 Colorful Accent 5" w:uiPriority="52"/>
-    <w:lsdException w:name="List Table 1 Light Accent 6" w:uiPriority="46"/>
-    <w:lsdException w:name="List Table 2 Accent 6" w:uiPriority="47"/>
-    <w:lsdException w:name="List Table 3 Accent 6" w:uiPriority="48"/>
-    <w:lsdException w:name="List Table 4 Accent 6" w:uiPriority="49"/>
-    <w:lsdException w:name="List Table 5 Dark Accent 6" w:uiPriority="50"/>
-    <w:lsdException w:name="List Table 6 Colorful Accent 6" w:uiPriority="51"/>
-    <w:lsdException w:name="List Table 7 Colorful Accent 6" w:uiPriority="52"/>
-    <w:lsdException w:name="Mention" w:semiHidden="1" w:unhideWhenUsed="1"/>
-    <w:lsdException w:name="Smart Hyperlink" w:semiHidden="1" w:unhideWhenUsed="1"/>
-    <w:lsdException w:name="Hashtag" w:semiHidden="1" w:unhideWhenUsed="1"/>
-    <w:lsdException w:name="Unresolved Mention" w:semiHidden="1" w:unhideWhenUsed="1"/>
-    <w:lsdException w:name="Smart Link" w:semiHidden="1" w:unhideWhenUsed="1"/>
+  <w:latentStyles w:defLockedState="0" w:defUIPriority="99" w:defSemiHidden="1" w:defUnhideWhenUsed="1" w:defQFormat="0" w:count="267">
+    <w:lsdException w:name="Normal" w:semiHidden="0" w:uiPriority="0" w:unhideWhenUsed="0" w:qFormat="1"/>
+    <w:lsdException w:name="heading 1" w:semiHidden="0" w:uiPriority="9" w:unhideWhenUsed="0" w:qFormat="1"/>
+    <w:lsdException w:name="heading 2" w:uiPriority="9" w:qFormat="1"/>
+    <w:lsdException w:name="heading 3" w:uiPriority="9" w:qFormat="1"/>
+    <w:lsdException w:name="heading 4" w:uiPriority="9" w:qFormat="1"/>
+    <w:lsdException w:name="heading 5" w:uiPriority="9" w:qFormat="1"/>
+    <w:lsdException w:name="heading 6" w:uiPriority="9" w:qFormat="1"/>
+    <w:lsdException w:name="heading 7" w:uiPriority="9" w:qFormat="1"/>
+    <w:lsdException w:name="heading 8" w:uiPriority="9" w:qFormat="1"/>
+    <w:lsdException w:name="heading 9" w:uiPriority="9" w:qFormat="1"/>
+    <w:lsdException w:name="toc 1" w:uiPriority="39"/>
+    <w:lsdException w:name="toc 2" w:uiPriority="39"/>
+    <w:lsdException w:name="toc 3" w:uiPriority="39"/>
+    <w:lsdException w:name="toc 4" w:uiPriority="39"/>
+    <w:lsdException w:name="toc 5" w:uiPriority="39"/>
+    <w:lsdException w:name="toc 6" w:uiPriority="39"/>
+    <w:lsdException w:name="toc 7" w:uiPriority="39"/>
+    <w:lsdException w:name="toc 8" w:uiPriority="39"/>
+    <w:lsdException w:name="toc 9" w:uiPriority="39"/>
+    <w:lsdException w:name="caption" w:uiPriority="35" w:qFormat="1"/>
+    <w:lsdException w:name="Title" w:semiHidden="0" w:uiPriority="10" w:unhideWhenUsed="0" w:qFormat="1"/>
+    <w:lsdException w:name="Default Paragraph Font" w:uiPriority="1"/>
+    <w:lsdException w:name="Subtitle" w:semiHidden="0" w:uiPriority="11" w:unhideWhenUsed="0" w:qFormat="1"/>
+    <w:lsdException w:name="Strong" w:semiHidden="0" w:uiPriority="22" w:unhideWhenUsed="0" w:qFormat="1"/>
+    <w:lsdException w:name="Emphasis" w:semiHidden="0" w:uiPriority="20" w:unhideWhenUsed="0" w:qFormat="1"/>
+    <w:lsdException w:name="Table Grid" w:semiHidden="0" w:uiPriority="39" w:unhideWhenUsed="0"/>
+    <w:lsdException w:name="Placeholder Text" w:unhideWhenUsed="0"/>
+    <w:lsdException w:name="No Spacing" w:semiHidden="0" w:uiPriority="1" w:unhideWhenUsed="0" w:qFormat="1"/>
+    <w:lsdException w:name="Light Shading" w:semiHidden="0" w:uiPriority="60" w:unhideWhenUsed="0"/>
+    <w:lsdException w:name="Light List" w:semiHidden="0" w:uiPriority="61" w:unhideWhenUsed="0"/>
+    <w:lsdException w:name="Light Grid" w:semiHidden="0" w:uiPriority="62" w:unhideWhenUsed="0"/>
+    <w:lsdException w:name="Medium Shading 1" w:semiHidden="0" w:uiPriority="63" w:unhideWhenUsed="0"/>
+    <w:lsdException w:name="Medium Shading 2" w:semiHidden="0" w:uiPriority="64" w:unhideWhenUsed="0"/>
+    <w:lsdException w:name="Medium List 1" w:semiHidden="0" w:uiPriority="65" w:unhideWhenUsed="0"/>
+    <w:lsdException w:name="Medium List 2" w:semiHidden="0" w:uiPriority="66" w:unhideWhenUsed="0"/>
+    <w:lsdException w:name="Medium Grid 1" w:semiHidden="0" w:uiPriority="67" w:unhideWhenUsed="0"/>
+    <w:lsdException w:name="Medium Grid 2" w:semiHidden="0" w:uiPriority="68" w:unhideWhenUsed="0"/>
+    <w:lsdException w:name="Medium Grid 3" w:semiHidden="0" w:uiPriority="69" w:unhideWhenUsed="0"/>
+    <w:lsdException w:name="Dark List" w:semiHidden="0" w:uiPriority="70" w:unhideWhenUsed="0"/>
+    <w:lsdException w:name="Colorful Shading" w:semiHidden="0" w:uiPriority="71" w:unhideWhenUsed="0"/>
+    <w:lsdException w:name="Colorful List" w:semiHidden="0" w:uiPriority="72" w:unhideWhenUsed="0"/>
+    <w:lsdException w:name="Colorful Grid" w:semiHidden="0" w:uiPriority="73" w:unhideWhenUsed="0"/>
+    <w:lsdException w:name="Light Shading Accent 1" w:semiHidden="0" w:uiPriority="60" w:unhideWhenUsed="0"/>
+    <w:lsdException w:name="Light List Accent 1" w:semiHidden="0" w:uiPriority="61" w:unhideWhenUsed="0"/>
+    <w:lsdException w:name="Light Grid Accent 1" w:semiHidden="0" w:uiPriority="62" w:unhideWhenUsed="0"/>
+    <w:lsdException w:name="Medium Shading 1 Accent 1" w:semiHidden="0" w:uiPriority="63" w:unhideWhenUsed="0"/>
+    <w:lsdException w:name="Medium Shading 2 Accent 1" w:semiHidden="0" w:uiPriority="64" w:unhideWhenUsed="0"/>
+    <w:lsdException w:name="Medium List 1 Accent 1" w:semiHidden="0" w:uiPriority="65" w:unhideWhenUsed="0"/>
+    <w:lsdException w:name="Revision" w:unhideWhenUsed="0"/>
+    <w:lsdException w:name="List Paragraph" w:semiHidden="0" w:uiPriority="34" w:unhideWhenUsed="0" w:qFormat="1"/>
+    <w:lsdException w:name="Quote" w:semiHidden="0" w:uiPriority="29" w:unhideWhenUsed="0" w:qFormat="1"/>
+    <w:lsdException w:name="Intense Quote" w:semiHidden="0" w:uiPriority="30" w:unhideWhenUsed="0" w:qFormat="1"/>
+    <w:lsdException w:name="Medium List 2 Accent 1" w:semiHidden="0" w:uiPriority="66" w:unhideWhenUsed="0"/>
+    <w:lsdException w:name="Medium Grid 1 Accent 1" w:semiHidden="0" w:uiPriority="67" w:unhideWhenUsed="0"/>
+    <w:lsdException w:name="Medium Grid 2 Accent 1" w:semiHidden="0" w:uiPriority="68" w:unhideWhenUsed="0"/>
+    <w:lsdException w:name="Medium Grid 3 Accent 1" w:semiHidden="0" w:uiPriority="69" w:unhideWhenUsed="0"/>
+    <w:lsdException w:name="Dark List Accent 1" w:semiHidden="0" w:uiPriority="70" w:unhideWhenUsed="0"/>
+    <w:lsdException w:name="Colorful Shading Accent 1" w:semiHidden="0" w:uiPriority="71" w:unhideWhenUsed="0"/>
+    <w:lsdException w:name="Colorful List Accent 1" w:semiHidden="0" w:uiPriority="72" w:unhideWhenUsed="0"/>
+    <w:lsdException w:name="Colorful Grid Accent 1" w:semiHidden="0" w:uiPriority="73" w:unhideWhenUsed="0"/>
+    <w:lsdException w:name="Light Shading Accent 2" w:semiHidden="0" w:uiPriority="60" w:unhideWhenUsed="0"/>
+    <w:lsdException w:name="Light List Accent 2" w:semiHidden="0" w:uiPriority="61" w:unhideWhenUsed="0"/>
+    <w:lsdException w:name="Light Grid Accent 2" w:semiHidden="0" w:uiPriority="62" w:unhideWhenUsed="0"/>
+    <w:lsdException w:name="Medium Shading 1 Accent 2" w:semiHidden="0" w:uiPriority="63" w:unhideWhenUsed="0"/>
+    <w:lsdException w:name="Medium Shading 2 Accent 2" w:semiHidden="0" w:uiPriority="64" w:unhideWhenUsed="0"/>
+    <w:lsdException w:name="Medium List 1 Accent 2" w:semiHidden="0" w:uiPriority="65" w:unhideWhenUsed="0"/>
+    <w:lsdException w:name="Medium List 2 Accent 2" w:semiHidden="0" w:uiPriority="66" w:unhideWhenUsed="0"/>
+    <w:lsdException w:name="Medium Grid 1 Accent 2" w:semiHidden="0" w:uiPriority="67" w:unhideWhenUsed="0"/>
+    <w:lsdException w:name="Medium Grid 2 Accent 2" w:semiHidden="0" w:uiPriority="68" w:unhideWhenUsed="0"/>
+    <w:lsdException w:name="Medium Grid 3 Accent 2" w:semiHidden="0" w:uiPriority="69" w:unhideWhenUsed="0"/>
+    <w:lsdException w:name="Dark List Accent 2" w:semiHidden="0" w:uiPriority="70" w:unhideWhenUsed="0"/>
+    <w:lsdException w:name="Colorful Shading Accent 2" w:semiHidden="0" w:uiPriority="71" w:unhideWhenUsed="0"/>
+    <w:lsdException w:name="Colorful List Accent 2" w:semiHidden="0" w:uiPriority="72" w:unhideWhenUsed="0"/>
+    <w:lsdException w:name="Colorful Grid Accent 2" w:semiHidden="0" w:uiPriority="73" w:unhideWhenUsed="0"/>
+    <w:lsdException w:name="Light Shading Accent 3" w:semiHidden="0" w:uiPriority="60" w:unhideWhenUsed="0"/>
+    <w:lsdException w:name="Light List Accent 3" w:semiHidden="0" w:uiPriority="61" w:unhideWhenUsed="0"/>
+    <w:lsdException w:name="Light Grid Accent 3" w:semiHidden="0" w:uiPriority="62" w:unhideWhenUsed="0"/>
+    <w:lsdException w:name="Medium Shading 1 Accent 3" w:semiHidden="0" w:uiPriority="63" w:unhideWhenUsed="0"/>
+    <w:lsdException w:name="Medium Shading 2 Accent 3" w:semiHidden="0" w:uiPriority="64" w:unhideWhenUsed="0"/>
+    <w:lsdException w:name="Medium List 1 Accent 3" w:semiHidden="0" w:uiPriority="65" w:unhideWhenUsed="0"/>
+    <w:lsdException w:name="Medium List 2 Accent 3" w:semiHidden="0" w:uiPriority="66" w:unhideWhenUsed="0"/>
+    <w:lsdException w:name="Medium Grid 1 Accent 3" w:semiHidden="0" w:uiPriority="67" w:unhideWhenUsed="0"/>
+    <w:lsdException w:name="Medium Grid 2 Accent 3" w:semiHidden="0" w:uiPriority="68" w:unhideWhenUsed="0"/>
+    <w:lsdException w:name="Medium Grid 3 Accent 3" w:semiHidden="0" w:uiPriority="69" w:unhideWhenUsed="0"/>
+    <w:lsdException w:name="Dark List Accent 3" w:semiHidden="0" w:uiPriority="70" w:unhideWhenUsed="0"/>
+    <w:lsdException w:name="Colorful Shading Accent 3" w:semiHidden="0" w:uiPriority="71" w:unhideWhenUsed="0"/>
+    <w:lsdException w:name="Colorful List Accent 3" w:semiHidden="0" w:uiPriority="72" w:unhideWhenUsed="0"/>
+    <w:lsdException w:name="Colorful Grid Accent 3" w:semiHidden="0" w:uiPriority="73" w:unhideWhenUsed="0"/>
+    <w:lsdException w:name="Light Shading Accent 4" w:semiHidden="0" w:uiPriority="60" w:unhideWhenUsed="0"/>
+    <w:lsdException w:name="Light List Accent 4" w:semiHidden="0" w:uiPriority="61" w:unhideWhenUsed="0"/>
+    <w:lsdException w:name="Light Grid Accent 4" w:semiHidden="0" w:uiPriority="62" w:unhideWhenUsed="0"/>
+    <w:lsdException w:name="Medium Shading 1 Accent 4" w:semiHidden="0" w:uiPriority="63" w:unhideWhenUsed="0"/>
+    <w:lsdException w:name="Medium Shading 2 Accent 4" w:semiHidden="0" w:uiPriority="64" w:unhideWhenUsed="0"/>
+    <w:lsdException w:name="Medium List 1 Accent 4" w:semiHidden="0" w:uiPriority="65" w:unhideWhenUsed="0"/>
+    <w:lsdException w:name="Medium List 2 Accent 4" w:semiHidden="0" w:uiPriority="66" w:unhideWhenUsed="0"/>
+    <w:lsdException w:name="Medium Grid 1 Accent 4" w:semiHidden="0" w:uiPriority="67" w:unhideWhenUsed="0"/>
+    <w:lsdException w:name="Medium Grid 2 Accent 4" w:semiHidden="0" w:uiPriority="68" w:unhideWhenUsed="0"/>
+    <w:lsdException w:name="Medium Grid 3 Accent 4" w:semiHidden="0" w:uiPriority="69" w:unhideWhenUsed="0"/>
+    <w:lsdException w:name="Dark List Accent 4" w:semiHidden="0" w:uiPriority="70" w:unhideWhenUsed="0"/>
+    <w:lsdException w:name="Colorful Shading Accent 4" w:semiHidden="0" w:uiPriority="71" w:unhideWhenUsed="0"/>
+    <w:lsdException w:name="Colorful List Accent 4" w:semiHidden="0" w:uiPriority="72" w:unhideWhenUsed="0"/>
+    <w:lsdException w:name="Colorful Grid Accent 4" w:semiHidden="0" w:uiPriority="73" w:unhideWhenUsed="0"/>
+    <w:lsdException w:name="Light Shading Accent 5" w:semiHidden="0" w:uiPriority="60" w:unhideWhenUsed="0"/>
+    <w:lsdException w:name="Light List Accent 5" w:semiHidden="0" w:uiPriority="61" w:unhideWhenUsed="0"/>
+    <w:lsdException w:name="Light Grid Accent 5" w:semiHidden="0" w:uiPriority="62" w:unhideWhenUsed="0"/>
+    <w:lsdException w:name="Medium Shading 1 Accent 5" w:semiHidden="0" w:uiPriority="63" w:unhideWhenUsed="0"/>
+    <w:lsdException w:name="Medium Shading 2 Accent 5" w:semiHidden="0" w:uiPriority="64" w:unhideWhenUsed="0"/>
+    <w:lsdException w:name="Medium List 1 Accent 5" w:semiHidden="0" w:uiPriority="65" w:unhideWhenUsed="0"/>
+    <w:lsdException w:name="Medium List 2 Accent 5" w:semiHidden="0" w:uiPriority="66" w:unhideWhenUsed="0"/>
+    <w:lsdException w:name="Medium Grid 1 Accent 5" w:semiHidden="0" w:uiPriority="67" w:unhideWhenUsed="0"/>
+    <w:lsdException w:name="Medium Grid 2 Accent 5" w:semiHidden="0" w:uiPriority="68" w:unhideWhenUsed="0"/>
+    <w:lsdException w:name="Medium Grid 3 Accent 5" w:semiHidden="0" w:uiPriority="69" w:unhideWhenUsed="0"/>
+    <w:lsdException w:name="Dark List Accent 5" w:semiHidden="0" w:uiPriority="70" w:unhideWhenUsed="0"/>
+    <w:lsdException w:name="Colorful Shading Accent 5" w:semiHidden="0" w:uiPriority="71" w:unhideWhenUsed="0"/>
+    <w:lsdException w:name="Colorful List Accent 5" w:semiHidden="0" w:uiPriority="72" w:unhideWhenUsed="0"/>
+    <w:lsdException w:name="Colorful Grid Accent 5" w:semiHidden="0" w:uiPriority="73" w:unhideWhenUsed="0"/>
+    <w:lsdException w:name="Light Shading Accent 6" w:semiHidden="0" w:uiPriority="60" w:unhideWhenUsed="0"/>
+    <w:lsdException w:name="Light List Accent 6" w:semiHidden="0" w:uiPriority="61" w:unhideWhenUsed="0"/>
+    <w:lsdException w:name="Light Grid Accent 6" w:semiHidden="0" w:uiPriority="62" w:unhideWhenUsed="0"/>
+    <w:lsdException w:name="Medium Shading 1 Accent 6" w:semiHidden="0" w:uiPriority="63" w:unhideWhenUsed="0"/>
+    <w:lsdException w:name="Medium Shading 2 Accent 6" w:semiHidden="0" w:uiPriority="64" w:unhideWhenUsed="0"/>
+    <w:lsdException w:name="Medium List 1 Accent 6" w:semiHidden="0" w:uiPriority="65" w:unhideWhenUsed="0"/>
+    <w:lsdException w:name="Medium List 2 Accent 6" w:semiHidden="0" w:uiPriority="66" w:unhideWhenUsed="0"/>
+    <w:lsdException w:name="Medium Grid 1 Accent 6" w:semiHidden="0" w:uiPriority="67" w:unhideWhenUsed="0"/>
+    <w:lsdException w:name="Medium Grid 2 Accent 6" w:semiHidden="0" w:uiPriority="68" w:unhideWhenUsed="0"/>
+    <w:lsdException w:name="Medium Grid 3 Accent 6" w:semiHidden="0" w:uiPriority="69" w:unhideWhenUsed="0"/>
+    <w:lsdException w:name="Dark List Accent 6" w:semiHidden="0" w:uiPriority="70" w:unhideWhenUsed="0"/>
+    <w:lsdException w:name="Colorful Shading Accent 6" w:semiHidden="0" w:uiPriority="71" w:unhideWhenUsed="0"/>
+    <w:lsdException w:name="Colorful List Accent 6" w:semiHidden="0" w:uiPriority="72" w:unhideWhenUsed="0"/>
+    <w:lsdException w:name="Colorful Grid Accent 6" w:semiHidden="0" w:uiPriority="73" w:unhideWhenUsed="0"/>
+    <w:lsdException w:name="Subtle Emphasis" w:semiHidden="0" w:uiPriority="19" w:unhideWhenUsed="0" w:qFormat="1"/>
+    <w:lsdException w:name="Intense Emphasis" w:semiHidden="0" w:uiPriority="21" w:unhideWhenUsed="0" w:qFormat="1"/>
+    <w:lsdException w:name="Subtle Reference" w:semiHidden="0" w:uiPriority="31" w:unhideWhenUsed="0" w:qFormat="1"/>
+    <w:lsdException w:name="Intense Reference" w:semiHidden="0" w:uiPriority="32" w:unhideWhenUsed="0" w:qFormat="1"/>
+    <w:lsdException w:name="Book Title" w:semiHidden="0" w:uiPriority="33" w:unhideWhenUsed="0" w:qFormat="1"/>
+    <w:lsdException w:name="Bibliography" w:uiPriority="37"/>
+    <w:lsdException w:name="TOC Heading" w:uiPriority="39" w:qFormat="1"/>
   </w:latentStyles>
   <w:style w:type="paragraph" w:default="1" w:styleId="Normal">
     <w:name w:val="Normal"/>
     <w:qFormat/>
+    <w:rsid w:val="002B5D68"/>
   </w:style>
   <w:style w:type="paragraph" w:styleId="Heading1">
     <w:name w:val="heading 1"/>
@@ -1136,6 +665,7 @@
     <w:next w:val="Normal"/>
     <w:uiPriority w:val="9"/>
     <w:qFormat/>
+    <w:rsid w:val="002B5D68"/>
     <w:pPr>
       <w:keepNext/>
       <w:keepLines/>
@@ -1155,6 +685,7 @@
     <w:uiPriority w:val="9"/>
     <w:unhideWhenUsed/>
     <w:qFormat/>
+    <w:rsid w:val="002B5D68"/>
     <w:pPr>
       <w:keepNext/>
       <w:keepLines/>
@@ -1174,6 +705,7 @@
     <w:uiPriority w:val="9"/>
     <w:unhideWhenUsed/>
     <w:qFormat/>
+    <w:rsid w:val="002B5D68"/>
     <w:pPr>
       <w:keepNext/>
       <w:keepLines/>
@@ -1194,6 +726,7 @@
     <w:semiHidden/>
     <w:unhideWhenUsed/>
     <w:qFormat/>
+    <w:rsid w:val="002B5D68"/>
     <w:pPr>
       <w:keepNext/>
       <w:keepLines/>
@@ -1214,6 +747,7 @@
     <w:semiHidden/>
     <w:unhideWhenUsed/>
     <w:qFormat/>
+    <w:rsid w:val="002B5D68"/>
     <w:pPr>
       <w:keepNext/>
       <w:keepLines/>
@@ -1232,6 +766,7 @@
     <w:semiHidden/>
     <w:unhideWhenUsed/>
     <w:qFormat/>
+    <w:rsid w:val="002B5D68"/>
     <w:pPr>
       <w:keepNext/>
       <w:keepLines/>
@@ -1255,6 +790,7 @@
     <w:uiPriority w:val="99"/>
     <w:semiHidden/>
     <w:unhideWhenUsed/>
+    <w:qFormat/>
     <w:tblPr>
       <w:tblInd w:w="0" w:type="dxa"/>
       <w:tblCellMar>
@@ -1277,6 +813,7 @@
     <w:next w:val="Normal"/>
     <w:uiPriority w:val="10"/>
     <w:qFormat/>
+    <w:rsid w:val="002B5D68"/>
     <w:pPr>
       <w:keepNext/>
       <w:keepLines/>
@@ -1297,6 +834,7 @@
       <w:spacing w:after="0" w:line="240" w:lineRule="auto"/>
     </w:pPr>
     <w:tblPr>
+      <w:tblInd w:w="0" w:type="dxa"/>
       <w:tblBorders>
         <w:top w:val="single" w:sz="4" w:space="0" w:color="auto"/>
         <w:left w:val="single" w:sz="4" w:space="0" w:color="auto"/>
@@ -1305,6 +843,12 @@
         <w:insideH w:val="single" w:sz="4" w:space="0" w:color="auto"/>
         <w:insideV w:val="single" w:sz="4" w:space="0" w:color="auto"/>
       </w:tblBorders>
+      <w:tblCellMar>
+        <w:top w:w="0" w:type="dxa"/>
+        <w:left w:w="108" w:type="dxa"/>
+        <w:bottom w:w="0" w:type="dxa"/>
+        <w:right w:w="108" w:type="dxa"/>
+      </w:tblCellMar>
     </w:tblPr>
   </w:style>
   <w:style w:type="character" w:styleId="Hyperlink">
@@ -1318,7 +862,7 @@
       <w:u w:val="single"/>
     </w:rPr>
   </w:style>
-  <w:style w:type="character" w:styleId="UnresolvedMention">
+  <w:style w:type="character" w:customStyle="1" w:styleId="UnresolvedMention">
     <w:name w:val="Unresolved Mention"/>
     <w:basedOn w:val="DefaultParagraphFont"/>
     <w:uiPriority w:val="99"/>
@@ -1368,6 +912,7 @@
     <w:next w:val="Normal"/>
     <w:uiPriority w:val="11"/>
     <w:qFormat/>
+    <w:rsid w:val="002B5D68"/>
     <w:pPr>
       <w:keepNext/>
       <w:keepLines/>
@@ -1383,12 +928,20 @@
   </w:style>
   <w:style w:type="table" w:customStyle="1" w:styleId="a">
     <w:basedOn w:val="TableNormal"/>
+    <w:rsid w:val="002B5D68"/>
     <w:pPr>
       <w:spacing w:after="0" w:line="240" w:lineRule="auto"/>
     </w:pPr>
     <w:tblPr>
       <w:tblStyleRowBandSize w:val="1"/>
       <w:tblStyleColBandSize w:val="1"/>
+      <w:tblInd w:w="0" w:type="dxa"/>
+      <w:tblCellMar>
+        <w:top w:w="0" w:type="dxa"/>
+        <w:left w:w="108" w:type="dxa"/>
+        <w:bottom w:w="0" w:type="dxa"/>
+        <w:right w:w="108" w:type="dxa"/>
+      </w:tblCellMar>
     </w:tblPr>
   </w:style>
   <w:style w:type="paragraph" w:styleId="Header">
@@ -1434,6 +987,36 @@
     <w:link w:val="Footer"/>
     <w:uiPriority w:val="99"/>
     <w:rsid w:val="00565A3D"/>
+  </w:style>
+  <w:style w:type="paragraph" w:styleId="BalloonText">
+    <w:name w:val="Balloon Text"/>
+    <w:basedOn w:val="Normal"/>
+    <w:link w:val="BalloonTextChar"/>
+    <w:uiPriority w:val="99"/>
+    <w:semiHidden/>
+    <w:unhideWhenUsed/>
+    <w:rsid w:val="00295E45"/>
+    <w:pPr>
+      <w:spacing w:after="0" w:line="240" w:lineRule="auto"/>
+    </w:pPr>
+    <w:rPr>
+      <w:rFonts w:ascii="Tahoma" w:hAnsi="Tahoma" w:cs="Tahoma"/>
+      <w:sz w:val="16"/>
+      <w:szCs w:val="16"/>
+    </w:rPr>
+  </w:style>
+  <w:style w:type="character" w:customStyle="1" w:styleId="BalloonTextChar">
+    <w:name w:val="Balloon Text Char"/>
+    <w:basedOn w:val="DefaultParagraphFont"/>
+    <w:link w:val="BalloonText"/>
+    <w:uiPriority w:val="99"/>
+    <w:semiHidden/>
+    <w:rsid w:val="00295E45"/>
+    <w:rPr>
+      <w:rFonts w:ascii="Tahoma" w:hAnsi="Tahoma" w:cs="Tahoma"/>
+      <w:sz w:val="16"/>
+      <w:szCs w:val="16"/>
+    </w:rPr>
   </w:style>
 </w:styles>
 </file>
@@ -1481,7 +1064,7 @@
     </a:clrScheme>
     <a:fontScheme name="Office">
       <a:majorFont>
-        <a:latin typeface="Calibri Light" panose="020F0302020204030204"/>
+        <a:latin typeface="Calibri Light"/>
         <a:ea typeface=""/>
         <a:cs typeface=""/>
         <a:font script="Jpan" typeface="游ゴシック Light"/>
@@ -1533,7 +1116,7 @@
         <a:font script="Tfng" typeface="Ebrima"/>
       </a:majorFont>
       <a:minorFont>
-        <a:latin typeface="Calibri" panose="020F0502020204030204"/>
+        <a:latin typeface="Calibri"/>
         <a:ea typeface=""/>
         <a:cs typeface=""/>
         <a:font script="Jpan" typeface="游明朝"/>
@@ -1727,7 +1310,7 @@
   <a:extraClrSchemeLst/>
   <a:extLst>
     <a:ext uri="{05A4C25C-085E-4340-85A3-A5531E510DB2}">
-      <thm15:themeFamily xmlns:thm15="http://schemas.microsoft.com/office/thememl/2012/main" name="Office Theme" id="{62F939B6-93AF-4DB8-9C6B-D6C7DFDC589F}" vid="{4A3C46E8-61CC-4603-A589-7422A47A8E4A}"/>
+      <thm15:themeFamily xmlns:thm15="http://schemas.microsoft.com/office/thememl/2012/main" xmlns="" name="Office Theme" id="{62F939B6-93AF-4DB8-9C6B-D6C7DFDC589F}" vid="{4A3C46E8-61CC-4603-A589-7422A47A8E4A}"/>
     </a:ext>
   </a:extLst>
 </a:theme>

</xml_diff>